<commit_message>
Add business case to report and presentations
</commit_message>
<xml_diff>
--- a/unterlagen/FHGR - UCXX (Moodle Scraping) - RPA SDD.docx
+++ b/unterlagen/FHGR - UCXX (Moodle Scraping) - RPA SDD.docx
@@ -3090,6 +3090,607 @@
       </w:tr>
     </w:tbl>
     <w:p/>
+    <w:p>
+      <w:pPr>
+        <w:pStyle w:val="berschrift1"/>
+        <w:pageBreakBefore/>
+      </w:pPr>
+      <w:r>
+        <w:t>Business Case / Wirtschaftlichkeit</w:t>
+      </w:r>
+    </w:p>
+    <w:p>
+      <w:r>
+        <w:t>Die Automatisierung ist wirtschaftlich sinnvoll, wenn sie nicht als einmaliger Studenten-Shortcut, sondern als wiederholbarer Lernmanagement-Prozess betrachtet wird. Die Rechnung ist bewusst konservativ und basiert auf den bereits dokumentierten Prozesskennzahlen.</w:t>
+      </w:r>
+    </w:p>
+    <w:tbl>
+      <w:tblPr>
+        <w:tblStyle w:val="Tabellenraster"/>
+        <w:tblW w:type="auto" w:w="0"/>
+        <w:jc w:val="center"/>
+        <w:tblLook w:firstColumn="1" w:firstRow="1" w:lastColumn="0" w:lastRow="0" w:noHBand="0" w:noVBand="1" w:val="04A0"/>
+      </w:tblPr>
+      <w:tblGrid>
+        <w:gridCol w:w="2324"/>
+        <w:gridCol w:w="2324"/>
+        <w:gridCol w:w="2324"/>
+        <w:gridCol w:w="2324"/>
+      </w:tblGrid>
+      <w:tr>
+        <w:tc>
+          <w:tcPr>
+            <w:tcW w:type="dxa" w:w="2324"/>
+            <w:vAlign w:val="center"/>
+            <w:tcMar>
+              <w:top w:w="90" w:type="dxa"/>
+              <w:left w:w="90" w:type="dxa"/>
+              <w:bottom w:w="90" w:type="dxa"/>
+              <w:right w:w="90" w:type="dxa"/>
+            </w:tcMar>
+          </w:tcPr>
+          <w:p>
+            <w:r/>
+            <w:r>
+              <w:rPr>
+                <w:b/>
+                <w:sz w:val="18"/>
+              </w:rPr>
+              <w:t>Annahme</w:t>
+            </w:r>
+          </w:p>
+        </w:tc>
+        <w:tc>
+          <w:tcPr>
+            <w:tcW w:type="dxa" w:w="2324"/>
+            <w:vAlign w:val="center"/>
+            <w:tcMar>
+              <w:top w:w="90" w:type="dxa"/>
+              <w:left w:w="90" w:type="dxa"/>
+              <w:bottom w:w="90" w:type="dxa"/>
+              <w:right w:w="90" w:type="dxa"/>
+            </w:tcMar>
+          </w:tcPr>
+          <w:p>
+            <w:r/>
+            <w:r>
+              <w:rPr>
+                <w:b/>
+                <w:sz w:val="18"/>
+              </w:rPr>
+              <w:t>Wert</w:t>
+            </w:r>
+          </w:p>
+        </w:tc>
+        <w:tc>
+          <w:tcPr>
+            <w:tcW w:type="dxa" w:w="2324"/>
+            <w:vAlign w:val="center"/>
+            <w:tcMar>
+              <w:top w:w="90" w:type="dxa"/>
+              <w:left w:w="90" w:type="dxa"/>
+              <w:bottom w:w="90" w:type="dxa"/>
+              <w:right w:w="90" w:type="dxa"/>
+            </w:tcMar>
+          </w:tcPr>
+          <w:p>
+            <w:r/>
+            <w:r>
+              <w:rPr>
+                <w:b/>
+                <w:sz w:val="18"/>
+              </w:rPr>
+              <w:t>Herleitung</w:t>
+            </w:r>
+          </w:p>
+        </w:tc>
+        <w:tc>
+          <w:tcPr>
+            <w:tcW w:type="dxa" w:w="2324"/>
+            <w:vAlign w:val="center"/>
+            <w:tcMar>
+              <w:top w:w="90" w:type="dxa"/>
+              <w:left w:w="90" w:type="dxa"/>
+              <w:bottom w:w="90" w:type="dxa"/>
+              <w:right w:w="90" w:type="dxa"/>
+            </w:tcMar>
+          </w:tcPr>
+          <w:p>
+            <w:r/>
+            <w:r>
+              <w:rPr>
+                <w:b/>
+                <w:sz w:val="18"/>
+              </w:rPr>
+              <w:t>Bedeutung</w:t>
+            </w:r>
+          </w:p>
+        </w:tc>
+      </w:tr>
+      <w:tr>
+        <w:tc>
+          <w:tcPr>
+            <w:tcW w:type="dxa" w:w="2324"/>
+            <w:vAlign w:val="center"/>
+            <w:tcMar>
+              <w:top w:w="90" w:type="dxa"/>
+              <w:left w:w="90" w:type="dxa"/>
+              <w:bottom w:w="90" w:type="dxa"/>
+              <w:right w:w="90" w:type="dxa"/>
+            </w:tcMar>
+          </w:tcPr>
+          <w:p>
+            <w:r/>
+            <w:r>
+              <w:rPr>
+                <w:b/>
+                <w:sz w:val="18"/>
+              </w:rPr>
+              <w:t>Volumen</w:t>
+            </w:r>
+          </w:p>
+        </w:tc>
+        <w:tc>
+          <w:tcPr>
+            <w:tcW w:type="dxa" w:w="2324"/>
+            <w:vAlign w:val="center"/>
+            <w:tcMar>
+              <w:top w:w="90" w:type="dxa"/>
+              <w:left w:w="90" w:type="dxa"/>
+              <w:bottom w:w="90" w:type="dxa"/>
+              <w:right w:w="90" w:type="dxa"/>
+            </w:tcMar>
+          </w:tcPr>
+          <w:p>
+            <w:r/>
+            <w:r>
+              <w:rPr>
+                <w:b w:val="0"/>
+                <w:sz w:val="18"/>
+              </w:rPr>
+              <w:t>140 Fälle / Semester</w:t>
+            </w:r>
+          </w:p>
+        </w:tc>
+        <w:tc>
+          <w:tcPr>
+            <w:tcW w:type="dxa" w:w="2324"/>
+            <w:vAlign w:val="center"/>
+            <w:tcMar>
+              <w:top w:w="90" w:type="dxa"/>
+              <w:left w:w="90" w:type="dxa"/>
+              <w:bottom w:w="90" w:type="dxa"/>
+              <w:right w:w="90" w:type="dxa"/>
+            </w:tcMar>
+          </w:tcPr>
+          <w:p>
+            <w:r/>
+            <w:r>
+              <w:rPr>
+                <w:b w:val="0"/>
+                <w:sz w:val="18"/>
+              </w:rPr>
+              <w:t>10 Fälle pro Woche × 14 Wochen</w:t>
+            </w:r>
+          </w:p>
+        </w:tc>
+        <w:tc>
+          <w:tcPr>
+            <w:tcW w:type="dxa" w:w="2324"/>
+            <w:vAlign w:val="center"/>
+            <w:tcMar>
+              <w:top w:w="90" w:type="dxa"/>
+              <w:left w:w="90" w:type="dxa"/>
+              <w:bottom w:w="90" w:type="dxa"/>
+              <w:right w:w="90" w:type="dxa"/>
+            </w:tcMar>
+          </w:tcPr>
+          <w:p>
+            <w:r/>
+            <w:r>
+              <w:rPr>
+                <w:b w:val="0"/>
+                <w:sz w:val="18"/>
+              </w:rPr>
+              <w:t>typischer FS26-Betrachtungshorizont</w:t>
+            </w:r>
+          </w:p>
+        </w:tc>
+      </w:tr>
+      <w:tr>
+        <w:tc>
+          <w:tcPr>
+            <w:tcW w:type="dxa" w:w="2324"/>
+            <w:vAlign w:val="center"/>
+            <w:tcMar>
+              <w:top w:w="90" w:type="dxa"/>
+              <w:left w:w="90" w:type="dxa"/>
+              <w:bottom w:w="90" w:type="dxa"/>
+              <w:right w:w="90" w:type="dxa"/>
+            </w:tcMar>
+          </w:tcPr>
+          <w:p>
+            <w:r/>
+            <w:r>
+              <w:rPr>
+                <w:b/>
+                <w:sz w:val="18"/>
+              </w:rPr>
+              <w:t>Manueller Aufwand</w:t>
+            </w:r>
+          </w:p>
+        </w:tc>
+        <w:tc>
+          <w:tcPr>
+            <w:tcW w:type="dxa" w:w="2324"/>
+            <w:vAlign w:val="center"/>
+            <w:tcMar>
+              <w:top w:w="90" w:type="dxa"/>
+              <w:left w:w="90" w:type="dxa"/>
+              <w:bottom w:w="90" w:type="dxa"/>
+              <w:right w:w="90" w:type="dxa"/>
+            </w:tcMar>
+          </w:tcPr>
+          <w:p>
+            <w:r/>
+            <w:r>
+              <w:rPr>
+                <w:b w:val="0"/>
+                <w:sz w:val="18"/>
+              </w:rPr>
+              <w:t>35.0 Stunden</w:t>
+            </w:r>
+          </w:p>
+        </w:tc>
+        <w:tc>
+          <w:tcPr>
+            <w:tcW w:type="dxa" w:w="2324"/>
+            <w:vAlign w:val="center"/>
+            <w:tcMar>
+              <w:top w:w="90" w:type="dxa"/>
+              <w:left w:w="90" w:type="dxa"/>
+              <w:bottom w:w="90" w:type="dxa"/>
+              <w:right w:w="90" w:type="dxa"/>
+            </w:tcMar>
+          </w:tcPr>
+          <w:p>
+            <w:r/>
+            <w:r>
+              <w:rPr>
+                <w:b w:val="0"/>
+                <w:sz w:val="18"/>
+              </w:rPr>
+              <w:t>140 Fälle × 15 Minuten</w:t>
+            </w:r>
+          </w:p>
+        </w:tc>
+        <w:tc>
+          <w:tcPr>
+            <w:tcW w:type="dxa" w:w="2324"/>
+            <w:vAlign w:val="center"/>
+            <w:tcMar>
+              <w:top w:w="90" w:type="dxa"/>
+              <w:left w:w="90" w:type="dxa"/>
+              <w:bottom w:w="90" w:type="dxa"/>
+              <w:right w:w="90" w:type="dxa"/>
+            </w:tcMar>
+          </w:tcPr>
+          <w:p>
+            <w:r/>
+            <w:r>
+              <w:rPr>
+                <w:b w:val="0"/>
+                <w:sz w:val="18"/>
+              </w:rPr>
+              <w:t>Suchen, Kopieren, Prompten und Prüfen ohne Bot</w:t>
+            </w:r>
+          </w:p>
+        </w:tc>
+      </w:tr>
+      <w:tr>
+        <w:tc>
+          <w:tcPr>
+            <w:tcW w:type="dxa" w:w="2324"/>
+            <w:vAlign w:val="center"/>
+            <w:tcMar>
+              <w:top w:w="90" w:type="dxa"/>
+              <w:left w:w="90" w:type="dxa"/>
+              <w:bottom w:w="90" w:type="dxa"/>
+              <w:right w:w="90" w:type="dxa"/>
+            </w:tcMar>
+          </w:tcPr>
+          <w:p>
+            <w:r/>
+            <w:r>
+              <w:rPr>
+                <w:b/>
+                <w:sz w:val="18"/>
+              </w:rPr>
+              <w:t>Restaufwand nach Automatisierung</w:t>
+            </w:r>
+          </w:p>
+        </w:tc>
+        <w:tc>
+          <w:tcPr>
+            <w:tcW w:type="dxa" w:w="2324"/>
+            <w:vAlign w:val="center"/>
+            <w:tcMar>
+              <w:top w:w="90" w:type="dxa"/>
+              <w:left w:w="90" w:type="dxa"/>
+              <w:bottom w:w="90" w:type="dxa"/>
+              <w:right w:w="90" w:type="dxa"/>
+            </w:tcMar>
+          </w:tcPr>
+          <w:p>
+            <w:r/>
+            <w:r>
+              <w:rPr>
+                <w:b w:val="0"/>
+                <w:sz w:val="18"/>
+              </w:rPr>
+              <w:t>4.7 Stunden</w:t>
+            </w:r>
+          </w:p>
+        </w:tc>
+        <w:tc>
+          <w:tcPr>
+            <w:tcW w:type="dxa" w:w="2324"/>
+            <w:vAlign w:val="center"/>
+            <w:tcMar>
+              <w:top w:w="90" w:type="dxa"/>
+              <w:left w:w="90" w:type="dxa"/>
+              <w:bottom w:w="90" w:type="dxa"/>
+              <w:right w:w="90" w:type="dxa"/>
+            </w:tcMar>
+          </w:tcPr>
+          <w:p>
+            <w:r/>
+            <w:r>
+              <w:rPr>
+                <w:b w:val="0"/>
+                <w:sz w:val="18"/>
+              </w:rPr>
+              <w:t>140 Fälle × 2 Minuten Kontrolle</w:t>
+            </w:r>
+          </w:p>
+        </w:tc>
+        <w:tc>
+          <w:tcPr>
+            <w:tcW w:type="dxa" w:w="2324"/>
+            <w:vAlign w:val="center"/>
+            <w:tcMar>
+              <w:top w:w="90" w:type="dxa"/>
+              <w:left w:w="90" w:type="dxa"/>
+              <w:bottom w:w="90" w:type="dxa"/>
+              <w:right w:w="90" w:type="dxa"/>
+            </w:tcMar>
+          </w:tcPr>
+          <w:p>
+            <w:r/>
+            <w:r>
+              <w:rPr>
+                <w:b w:val="0"/>
+                <w:sz w:val="18"/>
+              </w:rPr>
+              <w:t>Starten, Ergebnis prüfen, Ausnahmefälle behandeln</w:t>
+            </w:r>
+          </w:p>
+        </w:tc>
+      </w:tr>
+      <w:tr>
+        <w:tc>
+          <w:tcPr>
+            <w:tcW w:type="dxa" w:w="2324"/>
+            <w:vAlign w:val="center"/>
+            <w:tcMar>
+              <w:top w:w="90" w:type="dxa"/>
+              <w:left w:w="90" w:type="dxa"/>
+              <w:bottom w:w="90" w:type="dxa"/>
+              <w:right w:w="90" w:type="dxa"/>
+            </w:tcMar>
+          </w:tcPr>
+          <w:p>
+            <w:r/>
+            <w:r>
+              <w:rPr>
+                <w:b/>
+                <w:sz w:val="18"/>
+              </w:rPr>
+              <w:t>Netto-Zeitersparnis</w:t>
+            </w:r>
+          </w:p>
+        </w:tc>
+        <w:tc>
+          <w:tcPr>
+            <w:tcW w:type="dxa" w:w="2324"/>
+            <w:vAlign w:val="center"/>
+            <w:tcMar>
+              <w:top w:w="90" w:type="dxa"/>
+              <w:left w:w="90" w:type="dxa"/>
+              <w:bottom w:w="90" w:type="dxa"/>
+              <w:right w:w="90" w:type="dxa"/>
+            </w:tcMar>
+          </w:tcPr>
+          <w:p>
+            <w:r/>
+            <w:r>
+              <w:rPr>
+                <w:b w:val="0"/>
+                <w:sz w:val="18"/>
+              </w:rPr>
+              <w:t>30.3 Stunden / Semester</w:t>
+            </w:r>
+          </w:p>
+        </w:tc>
+        <w:tc>
+          <w:tcPr>
+            <w:tcW w:type="dxa" w:w="2324"/>
+            <w:vAlign w:val="center"/>
+            <w:tcMar>
+              <w:top w:w="90" w:type="dxa"/>
+              <w:left w:w="90" w:type="dxa"/>
+              <w:bottom w:w="90" w:type="dxa"/>
+              <w:right w:w="90" w:type="dxa"/>
+            </w:tcMar>
+          </w:tcPr>
+          <w:p>
+            <w:r/>
+            <w:r>
+              <w:rPr>
+                <w:b w:val="0"/>
+                <w:sz w:val="18"/>
+              </w:rPr>
+              <w:t>35.0h - 4.7h</w:t>
+            </w:r>
+          </w:p>
+        </w:tc>
+        <w:tc>
+          <w:tcPr>
+            <w:tcW w:type="dxa" w:w="2324"/>
+            <w:vAlign w:val="center"/>
+            <w:tcMar>
+              <w:top w:w="90" w:type="dxa"/>
+              <w:left w:w="90" w:type="dxa"/>
+              <w:bottom w:w="90" w:type="dxa"/>
+              <w:right w:w="90" w:type="dxa"/>
+            </w:tcMar>
+          </w:tcPr>
+          <w:p>
+            <w:r/>
+            <w:r>
+              <w:rPr>
+                <w:b w:val="0"/>
+                <w:sz w:val="18"/>
+              </w:rPr>
+              <w:t>realistischer Zeitgewinn nach menschlicher Prüfung</w:t>
+            </w:r>
+          </w:p>
+        </w:tc>
+      </w:tr>
+      <w:tr>
+        <w:tc>
+          <w:tcPr>
+            <w:tcW w:type="dxa" w:w="2324"/>
+            <w:vAlign w:val="center"/>
+            <w:tcMar>
+              <w:top w:w="90" w:type="dxa"/>
+              <w:left w:w="90" w:type="dxa"/>
+              <w:bottom w:w="90" w:type="dxa"/>
+              <w:right w:w="90" w:type="dxa"/>
+            </w:tcMar>
+          </w:tcPr>
+          <w:p>
+            <w:r/>
+            <w:r>
+              <w:rPr>
+                <w:b/>
+                <w:sz w:val="18"/>
+              </w:rPr>
+              <w:t>Interner Stundensatz</w:t>
+            </w:r>
+          </w:p>
+        </w:tc>
+        <w:tc>
+          <w:tcPr>
+            <w:tcW w:type="dxa" w:w="2324"/>
+            <w:vAlign w:val="center"/>
+            <w:tcMar>
+              <w:top w:w="90" w:type="dxa"/>
+              <w:left w:w="90" w:type="dxa"/>
+              <w:bottom w:w="90" w:type="dxa"/>
+              <w:right w:w="90" w:type="dxa"/>
+            </w:tcMar>
+          </w:tcPr>
+          <w:p>
+            <w:r/>
+            <w:r>
+              <w:rPr>
+                <w:b w:val="0"/>
+                <w:sz w:val="18"/>
+              </w:rPr>
+              <w:t>CHF 40 / Stunde</w:t>
+            </w:r>
+          </w:p>
+        </w:tc>
+        <w:tc>
+          <w:tcPr>
+            <w:tcW w:type="dxa" w:w="2324"/>
+            <w:vAlign w:val="center"/>
+            <w:tcMar>
+              <w:top w:w="90" w:type="dxa"/>
+              <w:left w:w="90" w:type="dxa"/>
+              <w:bottom w:w="90" w:type="dxa"/>
+              <w:right w:w="90" w:type="dxa"/>
+            </w:tcMar>
+          </w:tcPr>
+          <w:p>
+            <w:r/>
+            <w:r>
+              <w:rPr>
+                <w:b w:val="0"/>
+                <w:sz w:val="18"/>
+              </w:rPr>
+              <w:t>konservative Annahme für studentische/administrative Bearbeitung</w:t>
+            </w:r>
+          </w:p>
+        </w:tc>
+        <w:tc>
+          <w:tcPr>
+            <w:tcW w:type="dxa" w:w="2324"/>
+            <w:vAlign w:val="center"/>
+            <w:tcMar>
+              <w:top w:w="90" w:type="dxa"/>
+              <w:left w:w="90" w:type="dxa"/>
+              <w:bottom w:w="90" w:type="dxa"/>
+              <w:right w:w="90" w:type="dxa"/>
+            </w:tcMar>
+          </w:tcPr>
+          <w:p>
+            <w:r/>
+            <w:r>
+              <w:rPr>
+                <w:b w:val="0"/>
+                <w:sz w:val="18"/>
+              </w:rPr>
+              <w:t>Basis für den monetären Vergleich</w:t>
+            </w:r>
+          </w:p>
+        </w:tc>
+      </w:tr>
+    </w:tbl>
+    <w:p>
+      <w:r>
+        <w:rPr>
+          <w:b/>
+        </w:rPr>
+        <w:t xml:space="preserve">Monetäre Wirkung: </w:t>
+      </w:r>
+      <w:r>
+        <w:t>Der manuelle Semesteraufwand entspricht ca. CHF 1’400. Nach Automatisierung verbleiben ca. CHF 187 Kontrollaufwand. Daraus ergibt sich eine erwartete Ersparnis von ca. CHF 1’213 pro Semester.</w:t>
+      </w:r>
+    </w:p>
+    <w:p>
+      <w:r>
+        <w:rPr>
+          <w:b/>
+        </w:rPr>
+        <w:t xml:space="preserve">Kosten der Umsetzung: </w:t>
+      </w:r>
+      <w:r>
+        <w:t>Für die einmalige Entwicklung und Dokumentation wird konservativ mit ca. 35 Stunden gerechnet, also ca. CHF 1’400 bei CHF 40/h. Zusätzliche Toolkosten sind gering: UiPath Community/Studio im Ausbildungskontext, Docker lokal, Moodle API lokal und Gemini API im erwarteten Nutzungsumfang im einstelligen CHF-Bereich pro Semester. Laufende Wartung wird mit ca. 2 Stunden pro Semester angesetzt.</w:t>
+      </w:r>
+    </w:p>
+    <w:p>
+      <w:r>
+        <w:rPr>
+          <w:b/>
+        </w:rPr>
+        <w:t xml:space="preserve">ROI-Einschätzung: </w:t>
+      </w:r>
+      <w:r>
+        <w:t>Bei nur einem einzelnen Studentenprozess amortisiert sich der Aufbau ungefähr nach 1.2 Semestern. Wird der Prozess für mehrere Studierende, mehrere Kurse oder wiederkehrende Studiengänge verwendet, sinkt die Amortisationszeit deutlich. Der qualitative Nutzen besteht zusätzlich in weniger Copy/Paste-Fehlern, reproduzierbarer Quellenlage und besser nachvollziehbaren Lernplan-Ergebnissen.</w:t>
+      </w:r>
+    </w:p>
     <w:p>
       <w:pPr>
         <w:pStyle w:val="berschrift1"/>

</xml_diff>

<commit_message>
Complete written report requirements
</commit_message>
<xml_diff>
--- a/unterlagen/FHGR - UCXX (Moodle Scraping) - RPA SDD.docx
+++ b/unterlagen/FHGR - UCXX (Moodle Scraping) - RPA SDD.docx
@@ -66,19 +66,6 @@
     </w:p>
     <w:p>
       <w:pPr>
-        <w:rPr>
-          <w:lang w:val="fr-CH"/>
-        </w:rPr>
-      </w:pPr>
-      <w:r>
-        <w:rPr>
-          <w:lang w:val="fr-CH"/>
-        </w:rPr>
-        <w:br w:type="page"/>
-      </w:r>
-    </w:p>
-    <w:p>
-      <w:pPr>
         <w:pStyle w:val="Betreff"/>
       </w:pPr>
       <w:r>
@@ -687,6 +674,48 @@
           </w:p>
         </w:tc>
       </w:tr>
+      <w:tr>
+        <w:tc>
+          <w:tcPr>
+            <w:tcW w:type="dxa" w:w="988"/>
+          </w:tcPr>
+          <w:p>
+            <w:r>
+              <w:t>0.4</w:t>
+            </w:r>
+          </w:p>
+        </w:tc>
+        <w:tc>
+          <w:tcPr>
+            <w:tcW w:type="dxa" w:w="2126"/>
+          </w:tcPr>
+          <w:p>
+            <w:r>
+              <w:t>Oliver Schütz</w:t>
+            </w:r>
+          </w:p>
+        </w:tc>
+        <w:tc>
+          <w:tcPr>
+            <w:tcW w:type="dxa" w:w="3685"/>
+          </w:tcPr>
+          <w:p>
+            <w:r>
+              <w:t>Bericht vervollständigt: Business Case, Prozessübersicht, Reflexion, Ausblick</w:t>
+            </w:r>
+          </w:p>
+        </w:tc>
+        <w:tc>
+          <w:tcPr>
+            <w:tcW w:type="dxa" w:w="2261"/>
+          </w:tcPr>
+          <w:p>
+            <w:r>
+              <w:t>31.05.2026</w:t>
+            </w:r>
+          </w:p>
+        </w:tc>
+      </w:tr>
     </w:tbl>
     <w:p>
       <w:pPr>
@@ -1383,989 +1412,161 @@
     <w:p>
       <w:pPr>
         <w:pStyle w:val="Verzeichnis1"/>
-        <w:rPr>
-          <w:rFonts w:eastAsiaTheme="minorEastAsia"/>
-          <w:b w:val="0"/>
-          <w:noProof/>
-          <w:sz w:val="22"/>
-          <w:lang w:eastAsia="de-CH"/>
-        </w:rPr>
       </w:pPr>
       <w:r>
-        <w:fldChar w:fldCharType="begin"/>
+        <w:t>1.</w:t>
+        <w:tab/>
+        <w:t>Ziel des Dokumentes</w:t>
       </w:r>
-      <w:r>
-        <w:instrText xml:space="preserve"> TOC \o "1-2"</w:instrText>
-      </w:r>
-      <w:r>
-        <w:instrText xml:space="preserve"> \n 2-2</w:instrText>
-      </w:r>
-      <w:r>
-        <w:instrText xml:space="preserve"> \h \z \u </w:instrText>
-      </w:r>
-      <w:r>
-        <w:fldChar w:fldCharType="separate"/>
-      </w:r>
-      <w:hyperlink w:history="1" w:anchor="_Toc189321232">
-        <w:r>
-          <w:rPr>
-            <w:rStyle w:val="Hyperlink"/>
-            <w:noProof/>
-          </w:rPr>
-          <w:t>1.</w:t>
-        </w:r>
-        <w:r>
-          <w:rPr>
-            <w:rFonts w:eastAsiaTheme="minorEastAsia"/>
-            <w:b w:val="0"/>
-            <w:noProof/>
-            <w:sz w:val="22"/>
-            <w:lang w:eastAsia="de-CH"/>
-          </w:rPr>
-          <w:tab/>
-        </w:r>
-        <w:r>
-          <w:rPr>
-            <w:rStyle w:val="Hyperlink"/>
-            <w:noProof/>
-          </w:rPr>
-          <w:t>Ziel des Dokumentes</w:t>
-        </w:r>
-        <w:r>
-          <w:rPr>
-            <w:noProof/>
-            <w:webHidden/>
-          </w:rPr>
-          <w:tab/>
-        </w:r>
-        <w:r>
-          <w:rPr>
-            <w:noProof/>
-            <w:webHidden/>
-          </w:rPr>
-          <w:fldChar w:fldCharType="begin"/>
-        </w:r>
-        <w:r>
-          <w:rPr>
-            <w:noProof/>
-            <w:webHidden/>
-          </w:rPr>
-          <w:instrText xml:space="preserve"> PAGEREF _Toc189321232 \h </w:instrText>
-        </w:r>
-        <w:r>
-          <w:rPr>
-            <w:noProof/>
-            <w:webHidden/>
-          </w:rPr>
-        </w:r>
-        <w:r>
-          <w:rPr>
-            <w:noProof/>
-            <w:webHidden/>
-          </w:rPr>
-          <w:fldChar w:fldCharType="separate"/>
-        </w:r>
-        <w:r>
-          <w:rPr>
-            <w:noProof/>
-            <w:webHidden/>
-          </w:rPr>
-          <w:t>4</w:t>
-        </w:r>
-        <w:r>
-          <w:rPr>
-            <w:noProof/>
-            <w:webHidden/>
-          </w:rPr>
-          <w:fldChar w:fldCharType="end"/>
-        </w:r>
-      </w:hyperlink>
     </w:p>
     <w:p>
       <w:pPr>
         <w:pStyle w:val="Verzeichnis1"/>
-        <w:rPr>
-          <w:rFonts w:eastAsiaTheme="minorEastAsia"/>
-          <w:b w:val="0"/>
-          <w:noProof/>
-          <w:sz w:val="22"/>
-          <w:lang w:eastAsia="de-CH"/>
-        </w:rPr>
-      </w:pPr>
-      <w:hyperlink w:history="1" w:anchor="_Toc189321233">
-        <w:r>
-          <w:rPr>
-            <w:rStyle w:val="Hyperlink"/>
-            <w:noProof/>
-          </w:rPr>
-          <w:t>2.</w:t>
-        </w:r>
-        <w:r>
-          <w:rPr>
-            <w:rFonts w:eastAsiaTheme="minorEastAsia"/>
-            <w:b w:val="0"/>
-            <w:noProof/>
-            <w:sz w:val="22"/>
-            <w:lang w:eastAsia="de-CH"/>
-          </w:rPr>
-          <w:tab/>
-        </w:r>
-        <w:r>
-          <w:rPr>
-            <w:rStyle w:val="Hyperlink"/>
-            <w:noProof/>
-          </w:rPr>
-          <w:t>Prozessinformationen und -kennzahlen</w:t>
-        </w:r>
-        <w:r>
-          <w:rPr>
-            <w:noProof/>
-            <w:webHidden/>
-          </w:rPr>
-          <w:tab/>
-        </w:r>
-        <w:r>
-          <w:rPr>
-            <w:noProof/>
-            <w:webHidden/>
-          </w:rPr>
-          <w:fldChar w:fldCharType="begin"/>
-        </w:r>
-        <w:r>
-          <w:rPr>
-            <w:noProof/>
-            <w:webHidden/>
-          </w:rPr>
-          <w:instrText xml:space="preserve"> PAGEREF _Toc189321233 \h </w:instrText>
-        </w:r>
-        <w:r>
-          <w:rPr>
-            <w:noProof/>
-            <w:webHidden/>
-          </w:rPr>
-        </w:r>
-        <w:r>
-          <w:rPr>
-            <w:noProof/>
-            <w:webHidden/>
-          </w:rPr>
-          <w:fldChar w:fldCharType="separate"/>
-        </w:r>
-        <w:r>
-          <w:rPr>
-            <w:noProof/>
-            <w:webHidden/>
-          </w:rPr>
-          <w:t>4</w:t>
-        </w:r>
-        <w:r>
-          <w:rPr>
-            <w:noProof/>
-            <w:webHidden/>
-          </w:rPr>
-          <w:fldChar w:fldCharType="end"/>
-        </w:r>
-      </w:hyperlink>
+      </w:pPr>
+      <w:r>
+        <w:t>2.</w:t>
+        <w:tab/>
+        <w:t>Management Summary</w:t>
+      </w:r>
     </w:p>
     <w:p>
       <w:pPr>
         <w:pStyle w:val="Verzeichnis1"/>
-        <w:rPr>
-          <w:rFonts w:eastAsiaTheme="minorEastAsia"/>
-          <w:b w:val="0"/>
-          <w:noProof/>
-          <w:sz w:val="22"/>
-          <w:lang w:eastAsia="de-CH"/>
-        </w:rPr>
-      </w:pPr>
-      <w:hyperlink w:history="1" w:anchor="_Toc189321234">
-        <w:r>
-          <w:rPr>
-            <w:rStyle w:val="Hyperlink"/>
-            <w:noProof/>
-          </w:rPr>
-          <w:t>3.</w:t>
-        </w:r>
-        <w:r>
-          <w:rPr>
-            <w:rFonts w:eastAsiaTheme="minorEastAsia"/>
-            <w:b w:val="0"/>
-            <w:noProof/>
-            <w:sz w:val="22"/>
-            <w:lang w:eastAsia="de-CH"/>
-          </w:rPr>
-          <w:tab/>
-        </w:r>
-        <w:r>
-          <w:rPr>
-            <w:rStyle w:val="Hyperlink"/>
-            <w:noProof/>
-          </w:rPr>
-          <w:t>Prozessauslöser</w:t>
-        </w:r>
-        <w:r>
-          <w:rPr>
-            <w:noProof/>
-            <w:webHidden/>
-          </w:rPr>
-          <w:tab/>
-        </w:r>
-        <w:r>
-          <w:rPr>
-            <w:noProof/>
-            <w:webHidden/>
-          </w:rPr>
-          <w:fldChar w:fldCharType="begin"/>
-        </w:r>
-        <w:r>
-          <w:rPr>
-            <w:noProof/>
-            <w:webHidden/>
-          </w:rPr>
-          <w:instrText xml:space="preserve"> PAGEREF _Toc189321234 \h </w:instrText>
-        </w:r>
-        <w:r>
-          <w:rPr>
-            <w:noProof/>
-            <w:webHidden/>
-          </w:rPr>
-        </w:r>
-        <w:r>
-          <w:rPr>
-            <w:noProof/>
-            <w:webHidden/>
-          </w:rPr>
-          <w:fldChar w:fldCharType="separate"/>
-        </w:r>
-        <w:r>
-          <w:rPr>
-            <w:noProof/>
-            <w:webHidden/>
-          </w:rPr>
-          <w:t>4</w:t>
-        </w:r>
-        <w:r>
-          <w:rPr>
-            <w:noProof/>
-            <w:webHidden/>
-          </w:rPr>
-          <w:fldChar w:fldCharType="end"/>
-        </w:r>
-      </w:hyperlink>
+      </w:pPr>
+      <w:r>
+        <w:t>3.</w:t>
+        <w:tab/>
+        <w:t>Prozessinformationen und -kennzahlen</w:t>
+      </w:r>
     </w:p>
     <w:p>
       <w:pPr>
-        <w:pStyle w:val="Verzeichnis2"/>
-        <w:rPr>
-          <w:rFonts w:eastAsiaTheme="minorEastAsia"/>
-          <w:noProof/>
-          <w:sz w:val="22"/>
-          <w:lang w:eastAsia="de-CH"/>
-        </w:rPr>
-      </w:pPr>
-      <w:hyperlink w:history="1" w:anchor="_Toc189321235">
-        <w:r>
-          <w:rPr>
-            <w:rStyle w:val="Hyperlink"/>
-            <w:noProof/>
-          </w:rPr>
-          <w:t>3.1</w:t>
-        </w:r>
-        <w:r>
-          <w:rPr>
-            <w:rFonts w:eastAsiaTheme="minorEastAsia"/>
-            <w:noProof/>
-            <w:sz w:val="22"/>
-            <w:lang w:eastAsia="de-CH"/>
-          </w:rPr>
-          <w:tab/>
-        </w:r>
-        <w:r>
-          <w:rPr>
-            <w:rStyle w:val="Hyperlink"/>
-            <w:noProof/>
-          </w:rPr>
-          <w:t>Aktueller Prozessauslöser</w:t>
-        </w:r>
-      </w:hyperlink>
+        <w:pStyle w:val="Verzeichnis1"/>
+      </w:pPr>
+      <w:r>
+        <w:t>4.</w:t>
+        <w:tab/>
+        <w:t>Business Case / Wirtschaftlichkeit</w:t>
+      </w:r>
     </w:p>
     <w:p>
       <w:pPr>
-        <w:pStyle w:val="Verzeichnis2"/>
-        <w:rPr>
-          <w:rFonts w:eastAsiaTheme="minorEastAsia"/>
-          <w:noProof/>
-          <w:sz w:val="22"/>
-          <w:lang w:eastAsia="de-CH"/>
-        </w:rPr>
-      </w:pPr>
-      <w:hyperlink w:history="1" w:anchor="_Toc189321236">
-        <w:r>
-          <w:rPr>
-            <w:rStyle w:val="Hyperlink"/>
-            <w:noProof/>
-          </w:rPr>
-          <w:t>3.2</w:t>
-        </w:r>
-        <w:r>
-          <w:rPr>
-            <w:rFonts w:eastAsiaTheme="minorEastAsia"/>
-            <w:noProof/>
-            <w:sz w:val="22"/>
-            <w:lang w:eastAsia="de-CH"/>
-          </w:rPr>
-          <w:tab/>
-        </w:r>
-        <w:r>
-          <w:rPr>
-            <w:rStyle w:val="Hyperlink"/>
-            <w:noProof/>
-          </w:rPr>
-          <w:t>Zukünftiger Prozessauslöser</w:t>
-        </w:r>
-      </w:hyperlink>
+        <w:pStyle w:val="Verzeichnis1"/>
+      </w:pPr>
+      <w:r>
+        <w:t>5.</w:t>
+        <w:tab/>
+        <w:t>Prozessauslöser</w:t>
+      </w:r>
     </w:p>
     <w:p>
       <w:pPr>
-        <w:pStyle w:val="Verzeichnis1"/>
-        <w:rPr>
-          <w:rFonts w:eastAsiaTheme="minorEastAsia"/>
-          <w:b w:val="0"/>
-          <w:noProof/>
-          <w:sz w:val="22"/>
-          <w:lang w:eastAsia="de-CH"/>
-        </w:rPr>
-      </w:pPr>
-      <w:hyperlink w:history="1" w:anchor="_Toc189321237">
-        <w:r>
-          <w:rPr>
-            <w:rStyle w:val="Hyperlink"/>
-            <w:noProof/>
-          </w:rPr>
-          <w:t>4.</w:t>
-        </w:r>
-        <w:r>
-          <w:rPr>
-            <w:rFonts w:eastAsiaTheme="minorEastAsia"/>
-            <w:b w:val="0"/>
-            <w:noProof/>
-            <w:sz w:val="22"/>
-            <w:lang w:eastAsia="de-CH"/>
-          </w:rPr>
-          <w:tab/>
-        </w:r>
-        <w:r>
-          <w:rPr>
-            <w:rStyle w:val="Hyperlink"/>
-            <w:noProof/>
-          </w:rPr>
-          <w:t>Kernanwendungen</w:t>
-        </w:r>
-        <w:r>
-          <w:rPr>
-            <w:noProof/>
-            <w:webHidden/>
-          </w:rPr>
-          <w:tab/>
-        </w:r>
-        <w:r>
-          <w:rPr>
-            <w:noProof/>
-            <w:webHidden/>
-          </w:rPr>
-          <w:fldChar w:fldCharType="begin"/>
-        </w:r>
-        <w:r>
-          <w:rPr>
-            <w:noProof/>
-            <w:webHidden/>
-          </w:rPr>
-          <w:instrText xml:space="preserve"> PAGEREF _Toc189321237 \h </w:instrText>
-        </w:r>
-        <w:r>
-          <w:rPr>
-            <w:noProof/>
-            <w:webHidden/>
-          </w:rPr>
-        </w:r>
-        <w:r>
-          <w:rPr>
-            <w:noProof/>
-            <w:webHidden/>
-          </w:rPr>
-          <w:fldChar w:fldCharType="separate"/>
-        </w:r>
-        <w:r>
-          <w:rPr>
-            <w:noProof/>
-            <w:webHidden/>
-          </w:rPr>
-          <w:t>5</w:t>
-        </w:r>
-        <w:r>
-          <w:rPr>
-            <w:noProof/>
-            <w:webHidden/>
-          </w:rPr>
-          <w:fldChar w:fldCharType="end"/>
-        </w:r>
-      </w:hyperlink>
+        <w:pStyle w:val="Verzeichnis2"/>
+      </w:pPr>
+      <w:r>
+        <w:t>5.1</w:t>
+        <w:tab/>
+        <w:t>Aktueller Prozessauslöser</w:t>
+      </w:r>
     </w:p>
     <w:p>
       <w:pPr>
         <w:pStyle w:val="Verzeichnis2"/>
-        <w:rPr>
-          <w:rFonts w:eastAsiaTheme="minorEastAsia"/>
-          <w:noProof/>
-          <w:sz w:val="22"/>
-          <w:lang w:eastAsia="de-CH"/>
-        </w:rPr>
-      </w:pPr>
-      <w:hyperlink w:history="1" w:anchor="_Toc189321238">
-        <w:r>
-          <w:rPr>
-            <w:rStyle w:val="Hyperlink"/>
-            <w:noProof/>
-          </w:rPr>
-          <w:t>4.1</w:t>
-        </w:r>
-        <w:r>
-          <w:rPr>
-            <w:rFonts w:eastAsiaTheme="minorEastAsia"/>
-            <w:noProof/>
-            <w:sz w:val="22"/>
-            <w:lang w:eastAsia="de-CH"/>
-          </w:rPr>
-          <w:tab/>
-        </w:r>
-        <w:r>
-          <w:rPr>
-            <w:rStyle w:val="Hyperlink"/>
-            <w:noProof/>
-          </w:rPr>
-          <w:t>Bekannte, für diesen Prozess relevante Releasewechsel</w:t>
-        </w:r>
-      </w:hyperlink>
+      </w:pPr>
+      <w:r>
+        <w:t>5.2</w:t>
+        <w:tab/>
+        <w:t>Zukünftiger Prozessauslöser</w:t>
+      </w:r>
     </w:p>
     <w:p>
       <w:pPr>
         <w:pStyle w:val="Verzeichnis1"/>
-        <w:rPr>
-          <w:rFonts w:eastAsiaTheme="minorEastAsia"/>
-          <w:b w:val="0"/>
-          <w:noProof/>
-          <w:sz w:val="22"/>
-          <w:lang w:eastAsia="de-CH"/>
-        </w:rPr>
-      </w:pPr>
-      <w:hyperlink w:history="1" w:anchor="_Toc189321239">
-        <w:r>
-          <w:rPr>
-            <w:rStyle w:val="Hyperlink"/>
-            <w:noProof/>
-          </w:rPr>
-          <w:t>5.</w:t>
-        </w:r>
-        <w:r>
-          <w:rPr>
-            <w:rFonts w:eastAsiaTheme="minorEastAsia"/>
-            <w:b w:val="0"/>
-            <w:noProof/>
-            <w:sz w:val="22"/>
-            <w:lang w:eastAsia="de-CH"/>
-          </w:rPr>
-          <w:tab/>
-        </w:r>
-        <w:r>
-          <w:rPr>
-            <w:rStyle w:val="Hyperlink"/>
-            <w:noProof/>
-          </w:rPr>
-          <w:t>Prozessbeschreibung und -design</w:t>
-        </w:r>
-        <w:r>
-          <w:rPr>
-            <w:noProof/>
-            <w:webHidden/>
-          </w:rPr>
-          <w:tab/>
-        </w:r>
-        <w:r>
-          <w:rPr>
-            <w:noProof/>
-            <w:webHidden/>
-          </w:rPr>
-          <w:fldChar w:fldCharType="begin"/>
-        </w:r>
-        <w:r>
-          <w:rPr>
-            <w:noProof/>
-            <w:webHidden/>
-          </w:rPr>
-          <w:instrText xml:space="preserve"> PAGEREF _Toc189321239 \h </w:instrText>
-        </w:r>
-        <w:r>
-          <w:rPr>
-            <w:noProof/>
-            <w:webHidden/>
-          </w:rPr>
-        </w:r>
-        <w:r>
-          <w:rPr>
-            <w:noProof/>
-            <w:webHidden/>
-          </w:rPr>
-          <w:fldChar w:fldCharType="separate"/>
-        </w:r>
-        <w:r>
-          <w:rPr>
-            <w:noProof/>
-            <w:webHidden/>
-          </w:rPr>
-          <w:t>6</w:t>
-        </w:r>
-        <w:r>
-          <w:rPr>
-            <w:noProof/>
-            <w:webHidden/>
-          </w:rPr>
-          <w:fldChar w:fldCharType="end"/>
-        </w:r>
-      </w:hyperlink>
+      </w:pPr>
+      <w:r>
+        <w:t>6.</w:t>
+        <w:tab/>
+        <w:t>Kernanwendungen</w:t>
+      </w:r>
     </w:p>
     <w:p>
       <w:pPr>
-        <w:pStyle w:val="Verzeichnis2"/>
-        <w:rPr>
-          <w:rFonts w:eastAsiaTheme="minorEastAsia"/>
-          <w:noProof/>
-          <w:sz w:val="22"/>
-          <w:lang w:eastAsia="de-CH"/>
-        </w:rPr>
-      </w:pPr>
-      <w:hyperlink w:history="1" w:anchor="_Toc189321240">
-        <w:r>
-          <w:rPr>
-            <w:rStyle w:val="Hyperlink"/>
-            <w:noProof/>
-          </w:rPr>
-          <w:t>5.1</w:t>
-        </w:r>
-        <w:r>
-          <w:rPr>
-            <w:rFonts w:eastAsiaTheme="minorEastAsia"/>
-            <w:noProof/>
-            <w:sz w:val="22"/>
-            <w:lang w:eastAsia="de-CH"/>
-          </w:rPr>
-          <w:tab/>
-        </w:r>
-        <w:r>
-          <w:rPr>
-            <w:rStyle w:val="Hyperlink"/>
-            <w:noProof/>
-          </w:rPr>
-          <w:t>Prozessübersicht</w:t>
-        </w:r>
-      </w:hyperlink>
+        <w:pStyle w:val="Verzeichnis1"/>
+      </w:pPr>
+      <w:r>
+        <w:t>7.</w:t>
+        <w:tab/>
+        <w:t>Prozessbeschreibung und -design</w:t>
+      </w:r>
     </w:p>
     <w:p>
       <w:pPr>
         <w:pStyle w:val="Verzeichnis2"/>
-        <w:rPr>
-          <w:rFonts w:eastAsiaTheme="minorEastAsia"/>
-          <w:noProof/>
-          <w:sz w:val="22"/>
-          <w:lang w:eastAsia="de-CH"/>
-        </w:rPr>
-      </w:pPr>
-      <w:hyperlink w:history="1" w:anchor="_Toc189321241">
-        <w:r>
-          <w:rPr>
-            <w:rStyle w:val="Hyperlink"/>
-            <w:noProof/>
-          </w:rPr>
-          <w:t>5.2</w:t>
-        </w:r>
-        <w:r>
-          <w:rPr>
-            <w:rFonts w:eastAsiaTheme="minorEastAsia"/>
-            <w:noProof/>
-            <w:sz w:val="22"/>
-            <w:lang w:eastAsia="de-CH"/>
-          </w:rPr>
-          <w:tab/>
-        </w:r>
-        <w:r>
-          <w:rPr>
-            <w:rStyle w:val="Hyperlink"/>
-            <w:noProof/>
-          </w:rPr>
-          <w:t>Prozessschritte</w:t>
-        </w:r>
-      </w:hyperlink>
+      </w:pPr>
+      <w:r>
+        <w:t>7.1</w:t>
+        <w:tab/>
+        <w:t>Prozessübersicht</w:t>
+      </w:r>
     </w:p>
     <w:p>
       <w:pPr>
         <w:pStyle w:val="Verzeichnis2"/>
-        <w:rPr>
-          <w:rFonts w:eastAsiaTheme="minorEastAsia"/>
-          <w:noProof/>
-          <w:sz w:val="22"/>
-          <w:lang w:eastAsia="de-CH"/>
-        </w:rPr>
-      </w:pPr>
-      <w:hyperlink w:history="1" w:anchor="_Toc189321242">
-        <w:r>
-          <w:rPr>
-            <w:rStyle w:val="Hyperlink"/>
-            <w:noProof/>
-          </w:rPr>
-          <w:t>5.3</w:t>
-        </w:r>
-        <w:r>
-          <w:rPr>
-            <w:rFonts w:eastAsiaTheme="minorEastAsia"/>
-            <w:noProof/>
-            <w:sz w:val="22"/>
-            <w:lang w:eastAsia="de-CH"/>
-          </w:rPr>
-          <w:tab/>
-        </w:r>
-        <w:r>
-          <w:rPr>
-            <w:rStyle w:val="Hyperlink"/>
-            <w:noProof/>
-          </w:rPr>
-          <w:t>Exception Handling (Fehler, Ausnahmen und Pop up's)</w:t>
-        </w:r>
-      </w:hyperlink>
+      </w:pPr>
+      <w:r>
+        <w:t>7.2</w:t>
+        <w:tab/>
+        <w:t>Prozessschritte</w:t>
+      </w:r>
     </w:p>
     <w:p>
       <w:pPr>
-        <w:pStyle w:val="Verzeichnis1"/>
-        <w:rPr>
-          <w:rFonts w:eastAsiaTheme="minorEastAsia"/>
-          <w:b w:val="0"/>
-          <w:noProof/>
-          <w:sz w:val="22"/>
-          <w:lang w:eastAsia="de-CH"/>
-        </w:rPr>
-      </w:pPr>
-      <w:hyperlink w:history="1" w:anchor="_Toc189321243">
-        <w:r>
-          <w:rPr>
-            <w:rStyle w:val="Hyperlink"/>
-            <w:noProof/>
-          </w:rPr>
-          <w:t>6.</w:t>
-        </w:r>
-        <w:r>
-          <w:rPr>
-            <w:rFonts w:eastAsiaTheme="minorEastAsia"/>
-            <w:b w:val="0"/>
-            <w:noProof/>
-            <w:sz w:val="22"/>
-            <w:lang w:eastAsia="de-CH"/>
-          </w:rPr>
-          <w:tab/>
-        </w:r>
-        <w:r>
-          <w:rPr>
-            <w:rStyle w:val="Hyperlink"/>
-            <w:noProof/>
-          </w:rPr>
-          <w:t>Testing</w:t>
-        </w:r>
-        <w:r>
-          <w:rPr>
-            <w:noProof/>
-            <w:webHidden/>
-          </w:rPr>
-          <w:tab/>
-        </w:r>
-        <w:r>
-          <w:rPr>
-            <w:noProof/>
-            <w:webHidden/>
-          </w:rPr>
-          <w:fldChar w:fldCharType="begin"/>
-        </w:r>
-        <w:r>
-          <w:rPr>
-            <w:noProof/>
-            <w:webHidden/>
-          </w:rPr>
-          <w:instrText xml:space="preserve"> PAGEREF _Toc189321243 \h </w:instrText>
-        </w:r>
-        <w:r>
-          <w:rPr>
-            <w:noProof/>
-            <w:webHidden/>
-          </w:rPr>
-        </w:r>
-        <w:r>
-          <w:rPr>
-            <w:noProof/>
-            <w:webHidden/>
-          </w:rPr>
-          <w:fldChar w:fldCharType="separate"/>
-        </w:r>
-        <w:r>
-          <w:rPr>
-            <w:noProof/>
-            <w:webHidden/>
-          </w:rPr>
-          <w:t>13</w:t>
-        </w:r>
-        <w:r>
-          <w:rPr>
-            <w:noProof/>
-            <w:webHidden/>
-          </w:rPr>
-          <w:fldChar w:fldCharType="end"/>
-        </w:r>
-      </w:hyperlink>
+        <w:pStyle w:val="Verzeichnis2"/>
+      </w:pPr>
+      <w:r>
+        <w:t>7.3</w:t>
+        <w:tab/>
+        <w:t>Exception Handling (Fehler, Ausnahmen und Pop up's)</w:t>
+      </w:r>
     </w:p>
     <w:p>
       <w:pPr>
-        <w:pStyle w:val="Verzeichnis2"/>
-        <w:rPr>
-          <w:rFonts w:eastAsiaTheme="minorEastAsia"/>
-          <w:noProof/>
-          <w:sz w:val="22"/>
-          <w:lang w:eastAsia="de-CH"/>
-        </w:rPr>
-      </w:pPr>
-      <w:hyperlink w:history="1" w:anchor="_Toc189321244">
-        <w:r>
-          <w:rPr>
-            <w:rStyle w:val="Hyperlink"/>
-            <w:noProof/>
-          </w:rPr>
-          <w:t>6.1</w:t>
-        </w:r>
-        <w:r>
-          <w:rPr>
-            <w:rFonts w:eastAsiaTheme="minorEastAsia"/>
-            <w:noProof/>
-            <w:sz w:val="22"/>
-            <w:lang w:eastAsia="de-CH"/>
-          </w:rPr>
-          <w:tab/>
-        </w:r>
-        <w:r>
-          <w:rPr>
-            <w:rStyle w:val="Hyperlink"/>
-            <w:noProof/>
-          </w:rPr>
-          <w:t>Testfälle und Testdaten</w:t>
-        </w:r>
-      </w:hyperlink>
+        <w:pStyle w:val="Verzeichnis1"/>
+      </w:pPr>
+      <w:r>
+        <w:t>8.</w:t>
+        <w:tab/>
+        <w:t>Herausforderungen, Chancen und AI-Ausblick</w:t>
+      </w:r>
     </w:p>
     <w:p>
       <w:pPr>
-        <w:pStyle w:val="Verzeichnis2"/>
-        <w:rPr>
-          <w:rFonts w:eastAsiaTheme="minorEastAsia"/>
-          <w:noProof/>
-          <w:sz w:val="22"/>
-          <w:lang w:eastAsia="de-CH"/>
-        </w:rPr>
-      </w:pPr>
-      <w:hyperlink w:history="1" w:anchor="_Toc189321245">
-        <w:r>
-          <w:rPr>
-            <w:rStyle w:val="Hyperlink"/>
-            <w:noProof/>
-          </w:rPr>
-          <w:t>6.2</w:t>
-        </w:r>
-        <w:r>
-          <w:rPr>
-            <w:rFonts w:eastAsiaTheme="minorEastAsia"/>
-            <w:noProof/>
-            <w:sz w:val="22"/>
-            <w:lang w:eastAsia="de-CH"/>
-          </w:rPr>
-          <w:tab/>
-        </w:r>
-        <w:r>
-          <w:rPr>
-            <w:rStyle w:val="Hyperlink"/>
-            <w:noProof/>
-          </w:rPr>
-          <w:t>Generierung von Testfällen</w:t>
-        </w:r>
-      </w:hyperlink>
+        <w:pStyle w:val="Verzeichnis1"/>
+      </w:pPr>
+      <w:r>
+        <w:t>9.</w:t>
+        <w:tab/>
+        <w:t>Testing</w:t>
+      </w:r>
     </w:p>
     <w:p>
       <w:pPr>
         <w:pStyle w:val="Verzeichnis1"/>
-        <w:rPr>
-          <w:rFonts w:eastAsiaTheme="minorEastAsia"/>
-          <w:b w:val="0"/>
-          <w:noProof/>
-          <w:sz w:val="22"/>
-          <w:lang w:eastAsia="de-CH"/>
-        </w:rPr>
-      </w:pPr>
-      <w:hyperlink w:history="1" w:anchor="_Toc189321246">
-        <w:r>
-          <w:rPr>
-            <w:rStyle w:val="Hyperlink"/>
-            <w:noProof/>
-          </w:rPr>
-          <w:t>7.</w:t>
-        </w:r>
-        <w:r>
-          <w:rPr>
-            <w:rFonts w:eastAsiaTheme="minorEastAsia"/>
-            <w:b w:val="0"/>
-            <w:noProof/>
-            <w:sz w:val="22"/>
-            <w:lang w:eastAsia="de-CH"/>
-          </w:rPr>
-          <w:tab/>
-        </w:r>
-        <w:r>
-          <w:rPr>
-            <w:rStyle w:val="Hyperlink"/>
-            <w:noProof/>
-          </w:rPr>
-          <w:t>Appendix</w:t>
-        </w:r>
-        <w:r>
-          <w:rPr>
-            <w:noProof/>
-            <w:webHidden/>
-          </w:rPr>
-          <w:tab/>
-        </w:r>
-        <w:r>
-          <w:rPr>
-            <w:noProof/>
-            <w:webHidden/>
-          </w:rPr>
-          <w:fldChar w:fldCharType="begin"/>
-        </w:r>
-        <w:r>
-          <w:rPr>
-            <w:noProof/>
-            <w:webHidden/>
-          </w:rPr>
-          <w:instrText xml:space="preserve"> PAGEREF _Toc189321246 \h </w:instrText>
-        </w:r>
-        <w:r>
-          <w:rPr>
-            <w:noProof/>
-            <w:webHidden/>
-          </w:rPr>
-        </w:r>
-        <w:r>
-          <w:rPr>
-            <w:noProof/>
-            <w:webHidden/>
-          </w:rPr>
-          <w:fldChar w:fldCharType="separate"/>
-        </w:r>
-        <w:r>
-          <w:rPr>
-            <w:noProof/>
-            <w:webHidden/>
-          </w:rPr>
-          <w:t>13</w:t>
-        </w:r>
-        <w:r>
-          <w:rPr>
-            <w:noProof/>
-            <w:webHidden/>
-          </w:rPr>
-          <w:fldChar w:fldCharType="end"/>
-        </w:r>
-      </w:hyperlink>
+      </w:pPr>
+      <w:r>
+        <w:t>10.</w:t>
+        <w:tab/>
+        <w:t>Reflexion und Arbeitsaufteilung</w:t>
+      </w:r>
     </w:p>
     <w:p>
       <w:pPr>
-        <w:pStyle w:val="Verzeichnis2"/>
-        <w:rPr>
-          <w:rFonts w:eastAsiaTheme="minorEastAsia"/>
-          <w:noProof/>
-          <w:sz w:val="22"/>
-          <w:lang w:eastAsia="de-CH"/>
-        </w:rPr>
-      </w:pPr>
-      <w:hyperlink w:history="1" w:anchor="_Toc189321247">
-        <w:r>
-          <w:rPr>
-            <w:rStyle w:val="Hyperlink"/>
-            <w:noProof/>
-          </w:rPr>
-          <w:t>7.1</w:t>
-        </w:r>
-        <w:r>
-          <w:rPr>
-            <w:rFonts w:eastAsiaTheme="minorEastAsia"/>
-            <w:noProof/>
-            <w:sz w:val="22"/>
-            <w:lang w:eastAsia="de-CH"/>
-          </w:rPr>
-          <w:tab/>
-        </w:r>
-        <w:r>
-          <w:rPr>
-            <w:rStyle w:val="Hyperlink"/>
-            <w:noProof/>
-          </w:rPr>
-          <w:t>Speicherung der Login Daten</w:t>
-        </w:r>
-      </w:hyperlink>
-    </w:p>
-    <w:p>
-      <w:pPr>
-        <w:pStyle w:val="Verzeichnis2"/>
-        <w:rPr>
-          <w:rFonts w:eastAsiaTheme="minorEastAsia"/>
-          <w:noProof/>
-          <w:sz w:val="22"/>
-          <w:lang w:eastAsia="de-CH"/>
-        </w:rPr>
-      </w:pPr>
-      <w:hyperlink w:history="1" w:anchor="_Toc189321248">
-        <w:r>
-          <w:rPr>
-            <w:rStyle w:val="Hyperlink"/>
-            <w:noProof/>
-          </w:rPr>
-          <w:t>7.2</w:t>
-        </w:r>
-        <w:r>
-          <w:rPr>
-            <w:rFonts w:eastAsiaTheme="minorEastAsia"/>
-            <w:noProof/>
-            <w:sz w:val="22"/>
-            <w:lang w:eastAsia="de-CH"/>
-          </w:rPr>
-          <w:tab/>
-        </w:r>
-        <w:r>
-          <w:rPr>
-            <w:rStyle w:val="Hyperlink"/>
-            <w:noProof/>
-          </w:rPr>
-          <w:t>Risiken, Issues und Abhängigkeiten</w:t>
-        </w:r>
-      </w:hyperlink>
-    </w:p>
-    <w:p>
+        <w:pStyle w:val="Verzeichnis1"/>
+      </w:pPr>
       <w:r>
-        <w:fldChar w:fldCharType="end"/>
-      </w:r>
-    </w:p>
-    <w:p/>
-    <w:p>
-      <w:r>
-        <w:br w:type="page"/>
+        <w:t>11.</w:t>
+        <w:tab/>
+        <w:t>Appendix</w:t>
       </w:r>
     </w:p>
     <w:p>
@@ -2469,6 +1670,32 @@
       </w:r>
     </w:p>
     <w:p/>
+    <w:p>
+      <w:pPr>
+        <w:pStyle w:val="berschrift1"/>
+      </w:pPr>
+      <w:r>
+        <w:t>Management Summary</w:t>
+      </w:r>
+    </w:p>
+    <w:p>
+      <w:pPr/>
+      <w:r>
+        <w:t>Der Moodle-to-LLM Study Planner automatisiert einen wiederkehrenden Studienprozess: Moodle-Kurse und Kursressourcen werden ausgelesen, relevante Inhalte werden an ein LLM übergeben, daraus wird ein strukturierter Lernplan erzeugt und am Ende als PDF beziehungsweise E-Mail-Ergebnis bereitgestellt.</w:t>
+      </w:r>
+    </w:p>
+    <w:p>
+      <w:pPr/>
+      <w:r>
+        <w:t>Der Prozess eignet sich für RPA, weil die Eingabedaten digital vorliegen, der Ablauf wiederkehrend ist und die Entscheidungspunkte klar beschrieben werden können. Die Lösung ist bewusst als Attended Automation gestaltet: Der Roboter übernimmt Sammlung, Strukturierung und Ausgabe, während der Mensch das Ergebnis fachlich prüft.</w:t>
+      </w:r>
+    </w:p>
+    <w:p>
+      <w:pPr/>
+      <w:r>
+        <w:t>Wirtschaftlich ergibt sich bei 140 Fällen pro Semester ein manueller Aufwand von ca. 35 Stunden. Nach Automatisierung verbleiben ca. 4.7 Stunden Kontrollaufwand. Bei einem konservativen internen Satz von CHF 40/h entspricht dies einer Ersparnis von rund CHF 1'213 pro Semester.</w:t>
+      </w:r>
+    </w:p>
     <w:p>
       <w:pPr>
         <w:pStyle w:val="berschrift1"/>
@@ -4646,6 +3873,909 @@
       </w:r>
     </w:p>
     <w:p>
+      <w:pPr/>
+      <w:r>
+        <w:t>Die folgende Darstellung zeigt den Zielprozess in flowchart-naher Form. Der Ablauf trennt bewusst technische Automatisierungsschritte von menschlichen Prüfpunkten, damit das LLM-Ergebnis nicht ungeprüft übernommen wird.</w:t>
+      </w:r>
+    </w:p>
+    <w:tbl>
+      <w:tblPr>
+        <w:tblStyle w:val="Tabellenraster"/>
+        <w:tblW w:type="auto" w:w="0"/>
+        <w:jc w:val="center"/>
+        <w:tblLook w:firstColumn="1" w:firstRow="1" w:lastColumn="0" w:lastRow="0" w:noHBand="0" w:noVBand="1" w:val="04A0"/>
+      </w:tblPr>
+      <w:tblGrid>
+        <w:gridCol w:w="3099"/>
+        <w:gridCol w:w="3099"/>
+        <w:gridCol w:w="3099"/>
+      </w:tblGrid>
+      <w:tr>
+        <w:tc>
+          <w:tcPr>
+            <w:tcW w:type="dxa" w:w="3099"/>
+            <w:vAlign w:val="top"/>
+            <w:tcMar>
+              <w:top w:w="80" w:type="dxa"/>
+              <w:left w:w="80" w:type="dxa"/>
+              <w:bottom w:w="80" w:type="dxa"/>
+              <w:right w:w="80" w:type="dxa"/>
+            </w:tcMar>
+          </w:tcPr>
+          <w:p>
+            <w:r/>
+            <w:r>
+              <w:rPr>
+                <w:b/>
+                <w:sz w:val="17"/>
+              </w:rPr>
+              <w:t>Flowchart-Element</w:t>
+            </w:r>
+          </w:p>
+        </w:tc>
+        <w:tc>
+          <w:tcPr>
+            <w:tcW w:type="dxa" w:w="3099"/>
+            <w:vAlign w:val="top"/>
+            <w:tcMar>
+              <w:top w:w="80" w:type="dxa"/>
+              <w:left w:w="80" w:type="dxa"/>
+              <w:bottom w:w="80" w:type="dxa"/>
+              <w:right w:w="80" w:type="dxa"/>
+            </w:tcMar>
+          </w:tcPr>
+          <w:p>
+            <w:r/>
+            <w:r>
+              <w:rPr>
+                <w:b/>
+                <w:sz w:val="17"/>
+              </w:rPr>
+              <w:t>Schritt</w:t>
+            </w:r>
+          </w:p>
+        </w:tc>
+        <w:tc>
+          <w:tcPr>
+            <w:tcW w:type="dxa" w:w="3099"/>
+            <w:vAlign w:val="top"/>
+            <w:tcMar>
+              <w:top w:w="80" w:type="dxa"/>
+              <w:left w:w="80" w:type="dxa"/>
+              <w:bottom w:w="80" w:type="dxa"/>
+              <w:right w:w="80" w:type="dxa"/>
+            </w:tcMar>
+          </w:tcPr>
+          <w:p>
+            <w:r/>
+            <w:r>
+              <w:rPr>
+                <w:b/>
+                <w:sz w:val="17"/>
+              </w:rPr>
+              <w:t>Output / Entscheidung</w:t>
+            </w:r>
+          </w:p>
+        </w:tc>
+      </w:tr>
+      <w:tr>
+        <w:tc>
+          <w:tcPr>
+            <w:tcW w:type="dxa" w:w="3099"/>
+            <w:vAlign w:val="top"/>
+            <w:tcMar>
+              <w:top w:w="80" w:type="dxa"/>
+              <w:left w:w="80" w:type="dxa"/>
+              <w:bottom w:w="80" w:type="dxa"/>
+              <w:right w:w="80" w:type="dxa"/>
+            </w:tcMar>
+          </w:tcPr>
+          <w:p>
+            <w:r/>
+            <w:r>
+              <w:rPr>
+                <w:b/>
+                <w:sz w:val="17"/>
+              </w:rPr>
+              <w:t>Start</w:t>
+            </w:r>
+          </w:p>
+        </w:tc>
+        <w:tc>
+          <w:tcPr>
+            <w:tcW w:type="dxa" w:w="3099"/>
+            <w:vAlign w:val="top"/>
+            <w:tcMar>
+              <w:top w:w="80" w:type="dxa"/>
+              <w:left w:w="80" w:type="dxa"/>
+              <w:bottom w:w="80" w:type="dxa"/>
+              <w:right w:w="80" w:type="dxa"/>
+            </w:tcMar>
+          </w:tcPr>
+          <w:p>
+            <w:r/>
+            <w:r>
+              <w:rPr>
+                <w:b w:val="0"/>
+                <w:sz w:val="17"/>
+              </w:rPr>
+              <w:t>Benutzer startet UiPath-Prozess</w:t>
+            </w:r>
+          </w:p>
+        </w:tc>
+        <w:tc>
+          <w:tcPr>
+            <w:tcW w:type="dxa" w:w="3099"/>
+            <w:vAlign w:val="top"/>
+            <w:tcMar>
+              <w:top w:w="80" w:type="dxa"/>
+              <w:left w:w="80" w:type="dxa"/>
+              <w:bottom w:w="80" w:type="dxa"/>
+              <w:right w:w="80" w:type="dxa"/>
+            </w:tcMar>
+          </w:tcPr>
+          <w:p>
+            <w:r/>
+            <w:r>
+              <w:rPr>
+                <w:b w:val="0"/>
+                <w:sz w:val="17"/>
+              </w:rPr>
+              <w:t>Attended Start ohne sichtbare Secrets</w:t>
+            </w:r>
+          </w:p>
+        </w:tc>
+      </w:tr>
+      <w:tr>
+        <w:tc>
+          <w:tcPr>
+            <w:tcW w:type="dxa" w:w="3099"/>
+            <w:vAlign w:val="top"/>
+            <w:tcMar>
+              <w:top w:w="80" w:type="dxa"/>
+              <w:left w:w="80" w:type="dxa"/>
+              <w:bottom w:w="80" w:type="dxa"/>
+              <w:right w:w="80" w:type="dxa"/>
+            </w:tcMar>
+          </w:tcPr>
+          <w:p>
+            <w:r/>
+            <w:r>
+              <w:rPr>
+                <w:b/>
+                <w:sz w:val="17"/>
+              </w:rPr>
+              <w:t>Prozess</w:t>
+            </w:r>
+          </w:p>
+        </w:tc>
+        <w:tc>
+          <w:tcPr>
+            <w:tcW w:type="dxa" w:w="3099"/>
+            <w:vAlign w:val="top"/>
+            <w:tcMar>
+              <w:top w:w="80" w:type="dxa"/>
+              <w:left w:w="80" w:type="dxa"/>
+              <w:bottom w:w="80" w:type="dxa"/>
+              <w:right w:w="80" w:type="dxa"/>
+            </w:tcMar>
+          </w:tcPr>
+          <w:p>
+            <w:r/>
+            <w:r>
+              <w:rPr>
+                <w:b w:val="0"/>
+                <w:sz w:val="17"/>
+              </w:rPr>
+              <w:t>Konfiguration laden</w:t>
+            </w:r>
+          </w:p>
+        </w:tc>
+        <w:tc>
+          <w:tcPr>
+            <w:tcW w:type="dxa" w:w="3099"/>
+            <w:vAlign w:val="top"/>
+            <w:tcMar>
+              <w:top w:w="80" w:type="dxa"/>
+              <w:left w:w="80" w:type="dxa"/>
+              <w:bottom w:w="80" w:type="dxa"/>
+              <w:right w:w="80" w:type="dxa"/>
+            </w:tcMar>
+          </w:tcPr>
+          <w:p>
+            <w:r/>
+            <w:r>
+              <w:rPr>
+                <w:b w:val="0"/>
+                <w:sz w:val="17"/>
+              </w:rPr>
+              <w:t>.env, Moodle-API-URL, Gemini-Key und Ausgabeordner werden geladen</w:t>
+            </w:r>
+          </w:p>
+        </w:tc>
+      </w:tr>
+      <w:tr>
+        <w:tc>
+          <w:tcPr>
+            <w:tcW w:type="dxa" w:w="3099"/>
+            <w:vAlign w:val="top"/>
+            <w:tcMar>
+              <w:top w:w="80" w:type="dxa"/>
+              <w:left w:w="80" w:type="dxa"/>
+              <w:bottom w:w="80" w:type="dxa"/>
+              <w:right w:w="80" w:type="dxa"/>
+            </w:tcMar>
+          </w:tcPr>
+          <w:p>
+            <w:r/>
+            <w:r>
+              <w:rPr>
+                <w:b/>
+                <w:sz w:val="17"/>
+              </w:rPr>
+              <w:t>Prozess</w:t>
+            </w:r>
+          </w:p>
+        </w:tc>
+        <w:tc>
+          <w:tcPr>
+            <w:tcW w:type="dxa" w:w="3099"/>
+            <w:vAlign w:val="top"/>
+            <w:tcMar>
+              <w:top w:w="80" w:type="dxa"/>
+              <w:left w:w="80" w:type="dxa"/>
+              <w:bottom w:w="80" w:type="dxa"/>
+              <w:right w:w="80" w:type="dxa"/>
+            </w:tcMar>
+          </w:tcPr>
+          <w:p>
+            <w:r/>
+            <w:r>
+              <w:rPr>
+                <w:b w:val="0"/>
+                <w:sz w:val="17"/>
+              </w:rPr>
+              <w:t>Moodle API prüfen</w:t>
+            </w:r>
+          </w:p>
+        </w:tc>
+        <w:tc>
+          <w:tcPr>
+            <w:tcW w:type="dxa" w:w="3099"/>
+            <w:vAlign w:val="top"/>
+            <w:tcMar>
+              <w:top w:w="80" w:type="dxa"/>
+              <w:left w:w="80" w:type="dxa"/>
+              <w:bottom w:w="80" w:type="dxa"/>
+              <w:right w:w="80" w:type="dxa"/>
+            </w:tcMar>
+          </w:tcPr>
+          <w:p>
+            <w:r/>
+            <w:r>
+              <w:rPr>
+                <w:b w:val="0"/>
+                <w:sz w:val="17"/>
+              </w:rPr>
+              <w:t>Healthcheck und Login über lokalen Moodle-API-Container</w:t>
+            </w:r>
+          </w:p>
+        </w:tc>
+      </w:tr>
+      <w:tr>
+        <w:tc>
+          <w:tcPr>
+            <w:tcW w:type="dxa" w:w="3099"/>
+            <w:vAlign w:val="top"/>
+            <w:tcMar>
+              <w:top w:w="80" w:type="dxa"/>
+              <w:left w:w="80" w:type="dxa"/>
+              <w:bottom w:w="80" w:type="dxa"/>
+              <w:right w:w="80" w:type="dxa"/>
+            </w:tcMar>
+          </w:tcPr>
+          <w:p>
+            <w:r/>
+            <w:r>
+              <w:rPr>
+                <w:b/>
+                <w:sz w:val="17"/>
+              </w:rPr>
+              <w:t>Prozess</w:t>
+            </w:r>
+          </w:p>
+        </w:tc>
+        <w:tc>
+          <w:tcPr>
+            <w:tcW w:type="dxa" w:w="3099"/>
+            <w:vAlign w:val="top"/>
+            <w:tcMar>
+              <w:top w:w="80" w:type="dxa"/>
+              <w:left w:w="80" w:type="dxa"/>
+              <w:bottom w:w="80" w:type="dxa"/>
+              <w:right w:w="80" w:type="dxa"/>
+            </w:tcMar>
+          </w:tcPr>
+          <w:p>
+            <w:r/>
+            <w:r>
+              <w:rPr>
+                <w:b w:val="0"/>
+                <w:sz w:val="17"/>
+              </w:rPr>
+              <w:t>Kursliste abrufen</w:t>
+            </w:r>
+          </w:p>
+        </w:tc>
+        <w:tc>
+          <w:tcPr>
+            <w:tcW w:type="dxa" w:w="3099"/>
+            <w:vAlign w:val="top"/>
+            <w:tcMar>
+              <w:top w:w="80" w:type="dxa"/>
+              <w:left w:w="80" w:type="dxa"/>
+              <w:bottom w:w="80" w:type="dxa"/>
+              <w:right w:w="80" w:type="dxa"/>
+            </w:tcMar>
+          </w:tcPr>
+          <w:p>
+            <w:r/>
+            <w:r>
+              <w:rPr>
+                <w:b w:val="0"/>
+                <w:sz w:val="17"/>
+              </w:rPr>
+              <w:t>FS26-Kurse werden aus Moodle gelesen und gefiltert</w:t>
+            </w:r>
+          </w:p>
+        </w:tc>
+      </w:tr>
+      <w:tr>
+        <w:tc>
+          <w:tcPr>
+            <w:tcW w:type="dxa" w:w="3099"/>
+            <w:vAlign w:val="top"/>
+            <w:tcMar>
+              <w:top w:w="80" w:type="dxa"/>
+              <w:left w:w="80" w:type="dxa"/>
+              <w:bottom w:w="80" w:type="dxa"/>
+              <w:right w:w="80" w:type="dxa"/>
+            </w:tcMar>
+          </w:tcPr>
+          <w:p>
+            <w:r/>
+            <w:r>
+              <w:rPr>
+                <w:b/>
+                <w:sz w:val="17"/>
+              </w:rPr>
+              <w:t>Entscheidung</w:t>
+            </w:r>
+          </w:p>
+        </w:tc>
+        <w:tc>
+          <w:tcPr>
+            <w:tcW w:type="dxa" w:w="3099"/>
+            <w:vAlign w:val="top"/>
+            <w:tcMar>
+              <w:top w:w="80" w:type="dxa"/>
+              <w:left w:w="80" w:type="dxa"/>
+              <w:bottom w:w="80" w:type="dxa"/>
+              <w:right w:w="80" w:type="dxa"/>
+            </w:tcMar>
+          </w:tcPr>
+          <w:p>
+            <w:r/>
+            <w:r>
+              <w:rPr>
+                <w:b w:val="0"/>
+                <w:sz w:val="17"/>
+              </w:rPr>
+              <w:t>Nächster Kurs vorhanden?</w:t>
+            </w:r>
+          </w:p>
+        </w:tc>
+        <w:tc>
+          <w:tcPr>
+            <w:tcW w:type="dxa" w:w="3099"/>
+            <w:vAlign w:val="top"/>
+            <w:tcMar>
+              <w:top w:w="80" w:type="dxa"/>
+              <w:left w:w="80" w:type="dxa"/>
+              <w:bottom w:w="80" w:type="dxa"/>
+              <w:right w:w="80" w:type="dxa"/>
+            </w:tcMar>
+          </w:tcPr>
+          <w:p>
+            <w:r/>
+            <w:r>
+              <w:rPr>
+                <w:b w:val="0"/>
+                <w:sz w:val="17"/>
+              </w:rPr>
+              <w:t>Ja: Kurs wird verarbeitet. Nein: Abschluss-Mail wird erzeugt</w:t>
+            </w:r>
+          </w:p>
+        </w:tc>
+      </w:tr>
+      <w:tr>
+        <w:tc>
+          <w:tcPr>
+            <w:tcW w:type="dxa" w:w="3099"/>
+            <w:vAlign w:val="top"/>
+            <w:tcMar>
+              <w:top w:w="80" w:type="dxa"/>
+              <w:left w:w="80" w:type="dxa"/>
+              <w:bottom w:w="80" w:type="dxa"/>
+              <w:right w:w="80" w:type="dxa"/>
+            </w:tcMar>
+          </w:tcPr>
+          <w:p>
+            <w:r/>
+            <w:r>
+              <w:rPr>
+                <w:b/>
+                <w:sz w:val="17"/>
+              </w:rPr>
+              <w:t>Prozess</w:t>
+            </w:r>
+          </w:p>
+        </w:tc>
+        <w:tc>
+          <w:tcPr>
+            <w:tcW w:type="dxa" w:w="3099"/>
+            <w:vAlign w:val="top"/>
+            <w:tcMar>
+              <w:top w:w="80" w:type="dxa"/>
+              <w:left w:w="80" w:type="dxa"/>
+              <w:bottom w:w="80" w:type="dxa"/>
+              <w:right w:w="80" w:type="dxa"/>
+            </w:tcMar>
+          </w:tcPr>
+          <w:p>
+            <w:r/>
+            <w:r>
+              <w:rPr>
+                <w:b w:val="0"/>
+                <w:sz w:val="17"/>
+              </w:rPr>
+              <w:t>Kursressourcen abrufen</w:t>
+            </w:r>
+          </w:p>
+        </w:tc>
+        <w:tc>
+          <w:tcPr>
+            <w:tcW w:type="dxa" w:w="3099"/>
+            <w:vAlign w:val="top"/>
+            <w:tcMar>
+              <w:top w:w="80" w:type="dxa"/>
+              <w:left w:w="80" w:type="dxa"/>
+              <w:bottom w:w="80" w:type="dxa"/>
+              <w:right w:w="80" w:type="dxa"/>
+            </w:tcMar>
+          </w:tcPr>
+          <w:p>
+            <w:r/>
+            <w:r>
+              <w:rPr>
+                <w:b w:val="0"/>
+                <w:sz w:val="17"/>
+              </w:rPr>
+              <w:t>PDFs, Termine, Beschreibungen und relevante Quellen werden normalisiert</w:t>
+            </w:r>
+          </w:p>
+        </w:tc>
+      </w:tr>
+      <w:tr>
+        <w:tc>
+          <w:tcPr>
+            <w:tcW w:type="dxa" w:w="3099"/>
+            <w:vAlign w:val="top"/>
+            <w:tcMar>
+              <w:top w:w="80" w:type="dxa"/>
+              <w:left w:w="80" w:type="dxa"/>
+              <w:bottom w:w="80" w:type="dxa"/>
+              <w:right w:w="80" w:type="dxa"/>
+            </w:tcMar>
+          </w:tcPr>
+          <w:p>
+            <w:r/>
+            <w:r>
+              <w:rPr>
+                <w:b/>
+                <w:sz w:val="17"/>
+              </w:rPr>
+              <w:t>Entscheidung</w:t>
+            </w:r>
+          </w:p>
+        </w:tc>
+        <w:tc>
+          <w:tcPr>
+            <w:tcW w:type="dxa" w:w="3099"/>
+            <w:vAlign w:val="top"/>
+            <w:tcMar>
+              <w:top w:w="80" w:type="dxa"/>
+              <w:left w:w="80" w:type="dxa"/>
+              <w:bottom w:w="80" w:type="dxa"/>
+              <w:right w:w="80" w:type="dxa"/>
+            </w:tcMar>
+          </w:tcPr>
+          <w:p>
+            <w:r/>
+            <w:r>
+              <w:rPr>
+                <w:b w:val="0"/>
+                <w:sz w:val="17"/>
+              </w:rPr>
+              <w:t>Relevante Quelle vorhanden?</w:t>
+            </w:r>
+          </w:p>
+        </w:tc>
+        <w:tc>
+          <w:tcPr>
+            <w:tcW w:type="dxa" w:w="3099"/>
+            <w:vAlign w:val="top"/>
+            <w:tcMar>
+              <w:top w:w="80" w:type="dxa"/>
+              <w:left w:w="80" w:type="dxa"/>
+              <w:bottom w:w="80" w:type="dxa"/>
+              <w:right w:w="80" w:type="dxa"/>
+            </w:tcMar>
+          </w:tcPr>
+          <w:p>
+            <w:r/>
+            <w:r>
+              <w:rPr>
+                <w:b w:val="0"/>
+                <w:sz w:val="17"/>
+              </w:rPr>
+              <w:t>Nein: Warnung loggen und nächsten Kurs bearbeiten</w:t>
+            </w:r>
+          </w:p>
+        </w:tc>
+      </w:tr>
+      <w:tr>
+        <w:tc>
+          <w:tcPr>
+            <w:tcW w:type="dxa" w:w="3099"/>
+            <w:vAlign w:val="top"/>
+            <w:tcMar>
+              <w:top w:w="80" w:type="dxa"/>
+              <w:left w:w="80" w:type="dxa"/>
+              <w:bottom w:w="80" w:type="dxa"/>
+              <w:right w:w="80" w:type="dxa"/>
+            </w:tcMar>
+          </w:tcPr>
+          <w:p>
+            <w:r/>
+            <w:r>
+              <w:rPr>
+                <w:b/>
+                <w:sz w:val="17"/>
+              </w:rPr>
+              <w:t>Prozess</w:t>
+            </w:r>
+          </w:p>
+        </w:tc>
+        <w:tc>
+          <w:tcPr>
+            <w:tcW w:type="dxa" w:w="3099"/>
+            <w:vAlign w:val="top"/>
+            <w:tcMar>
+              <w:top w:w="80" w:type="dxa"/>
+              <w:left w:w="80" w:type="dxa"/>
+              <w:bottom w:w="80" w:type="dxa"/>
+              <w:right w:w="80" w:type="dxa"/>
+            </w:tcMar>
+          </w:tcPr>
+          <w:p>
+            <w:r/>
+            <w:r>
+              <w:rPr>
+                <w:b w:val="0"/>
+                <w:sz w:val="17"/>
+              </w:rPr>
+              <w:t>LLM-Anfrage erzeugen</w:t>
+            </w:r>
+          </w:p>
+        </w:tc>
+        <w:tc>
+          <w:tcPr>
+            <w:tcW w:type="dxa" w:w="3099"/>
+            <w:vAlign w:val="top"/>
+            <w:tcMar>
+              <w:top w:w="80" w:type="dxa"/>
+              <w:left w:w="80" w:type="dxa"/>
+              <w:bottom w:w="80" w:type="dxa"/>
+              <w:right w:w="80" w:type="dxa"/>
+            </w:tcMar>
+          </w:tcPr>
+          <w:p>
+            <w:r/>
+            <w:r>
+              <w:rPr>
+                <w:b w:val="0"/>
+                <w:sz w:val="17"/>
+              </w:rPr>
+              <w:t>Gemini erhält Kursdaten, Quellenliste und Lernplan-Template</w:t>
+            </w:r>
+          </w:p>
+        </w:tc>
+      </w:tr>
+      <w:tr>
+        <w:tc>
+          <w:tcPr>
+            <w:tcW w:type="dxa" w:w="3099"/>
+            <w:vAlign w:val="top"/>
+            <w:tcMar>
+              <w:top w:w="80" w:type="dxa"/>
+              <w:left w:w="80" w:type="dxa"/>
+              <w:bottom w:w="80" w:type="dxa"/>
+              <w:right w:w="80" w:type="dxa"/>
+            </w:tcMar>
+          </w:tcPr>
+          <w:p>
+            <w:r/>
+            <w:r>
+              <w:rPr>
+                <w:b/>
+                <w:sz w:val="17"/>
+              </w:rPr>
+              <w:t>Entscheidung</w:t>
+            </w:r>
+          </w:p>
+        </w:tc>
+        <w:tc>
+          <w:tcPr>
+            <w:tcW w:type="dxa" w:w="3099"/>
+            <w:vAlign w:val="top"/>
+            <w:tcMar>
+              <w:top w:w="80" w:type="dxa"/>
+              <w:left w:w="80" w:type="dxa"/>
+              <w:bottom w:w="80" w:type="dxa"/>
+              <w:right w:w="80" w:type="dxa"/>
+            </w:tcMar>
+          </w:tcPr>
+          <w:p>
+            <w:r/>
+            <w:r>
+              <w:rPr>
+                <w:b w:val="0"/>
+                <w:sz w:val="17"/>
+              </w:rPr>
+              <w:t>Antwort valide?</w:t>
+            </w:r>
+          </w:p>
+        </w:tc>
+        <w:tc>
+          <w:tcPr>
+            <w:tcW w:type="dxa" w:w="3099"/>
+            <w:vAlign w:val="top"/>
+            <w:tcMar>
+              <w:top w:w="80" w:type="dxa"/>
+              <w:left w:w="80" w:type="dxa"/>
+              <w:bottom w:w="80" w:type="dxa"/>
+              <w:right w:w="80" w:type="dxa"/>
+            </w:tcMar>
+          </w:tcPr>
+          <w:p>
+            <w:r/>
+            <w:r>
+              <w:rPr>
+                <w:b w:val="0"/>
+                <w:sz w:val="17"/>
+              </w:rPr>
+              <w:t>Bei ungültiger Antwort bis zu drei Retries; danach Fehler/Warnung</w:t>
+            </w:r>
+          </w:p>
+        </w:tc>
+      </w:tr>
+      <w:tr>
+        <w:tc>
+          <w:tcPr>
+            <w:tcW w:type="dxa" w:w="3099"/>
+            <w:vAlign w:val="top"/>
+            <w:tcMar>
+              <w:top w:w="80" w:type="dxa"/>
+              <w:left w:w="80" w:type="dxa"/>
+              <w:bottom w:w="80" w:type="dxa"/>
+              <w:right w:w="80" w:type="dxa"/>
+            </w:tcMar>
+          </w:tcPr>
+          <w:p>
+            <w:r/>
+            <w:r>
+              <w:rPr>
+                <w:b/>
+                <w:sz w:val="17"/>
+              </w:rPr>
+              <w:t>Prozess</w:t>
+            </w:r>
+          </w:p>
+        </w:tc>
+        <w:tc>
+          <w:tcPr>
+            <w:tcW w:type="dxa" w:w="3099"/>
+            <w:vAlign w:val="top"/>
+            <w:tcMar>
+              <w:top w:w="80" w:type="dxa"/>
+              <w:left w:w="80" w:type="dxa"/>
+              <w:bottom w:w="80" w:type="dxa"/>
+              <w:right w:w="80" w:type="dxa"/>
+            </w:tcMar>
+          </w:tcPr>
+          <w:p>
+            <w:r/>
+            <w:r>
+              <w:rPr>
+                <w:b w:val="0"/>
+                <w:sz w:val="17"/>
+              </w:rPr>
+              <w:t>Lernplan rendern</w:t>
+            </w:r>
+          </w:p>
+        </w:tc>
+        <w:tc>
+          <w:tcPr>
+            <w:tcW w:type="dxa" w:w="3099"/>
+            <w:vAlign w:val="top"/>
+            <w:tcMar>
+              <w:top w:w="80" w:type="dxa"/>
+              <w:left w:w="80" w:type="dxa"/>
+              <w:bottom w:w="80" w:type="dxa"/>
+              <w:right w:w="80" w:type="dxa"/>
+            </w:tcMar>
+          </w:tcPr>
+          <w:p>
+            <w:r/>
+            <w:r>
+              <w:rPr>
+                <w:b w:val="0"/>
+                <w:sz w:val="17"/>
+              </w:rPr>
+              <w:t>Markdown, HTML, PDF und Quellen-JSON werden gespeichert</w:t>
+            </w:r>
+          </w:p>
+        </w:tc>
+      </w:tr>
+      <w:tr>
+        <w:tc>
+          <w:tcPr>
+            <w:tcW w:type="dxa" w:w="3099"/>
+            <w:vAlign w:val="top"/>
+            <w:tcMar>
+              <w:top w:w="80" w:type="dxa"/>
+              <w:left w:w="80" w:type="dxa"/>
+              <w:bottom w:w="80" w:type="dxa"/>
+              <w:right w:w="80" w:type="dxa"/>
+            </w:tcMar>
+          </w:tcPr>
+          <w:p>
+            <w:r/>
+            <w:r>
+              <w:rPr>
+                <w:b/>
+                <w:sz w:val="17"/>
+              </w:rPr>
+              <w:t>Prozess</w:t>
+            </w:r>
+          </w:p>
+        </w:tc>
+        <w:tc>
+          <w:tcPr>
+            <w:tcW w:type="dxa" w:w="3099"/>
+            <w:vAlign w:val="top"/>
+            <w:tcMar>
+              <w:top w:w="80" w:type="dxa"/>
+              <w:left w:w="80" w:type="dxa"/>
+              <w:bottom w:w="80" w:type="dxa"/>
+              <w:right w:w="80" w:type="dxa"/>
+            </w:tcMar>
+          </w:tcPr>
+          <w:p>
+            <w:r/>
+            <w:r>
+              <w:rPr>
+                <w:b w:val="0"/>
+                <w:sz w:val="17"/>
+              </w:rPr>
+              <w:t>E-Mail vorbereiten/versenden</w:t>
+            </w:r>
+          </w:p>
+        </w:tc>
+        <w:tc>
+          <w:tcPr>
+            <w:tcW w:type="dxa" w:w="3099"/>
+            <w:vAlign w:val="top"/>
+            <w:tcMar>
+              <w:top w:w="80" w:type="dxa"/>
+              <w:left w:w="80" w:type="dxa"/>
+              <w:bottom w:w="80" w:type="dxa"/>
+              <w:right w:w="80" w:type="dxa"/>
+            </w:tcMar>
+          </w:tcPr>
+          <w:p>
+            <w:r/>
+            <w:r>
+              <w:rPr>
+                <w:b w:val="0"/>
+                <w:sz w:val="17"/>
+              </w:rPr>
+              <w:t>PDF wird angehängt, HTML-Ergebnis kann im Mailbody stehen</w:t>
+            </w:r>
+          </w:p>
+        </w:tc>
+      </w:tr>
+      <w:tr>
+        <w:tc>
+          <w:tcPr>
+            <w:tcW w:type="dxa" w:w="3099"/>
+            <w:vAlign w:val="top"/>
+            <w:tcMar>
+              <w:top w:w="80" w:type="dxa"/>
+              <w:left w:w="80" w:type="dxa"/>
+              <w:bottom w:w="80" w:type="dxa"/>
+              <w:right w:w="80" w:type="dxa"/>
+            </w:tcMar>
+          </w:tcPr>
+          <w:p>
+            <w:r/>
+            <w:r>
+              <w:rPr>
+                <w:b/>
+                <w:sz w:val="17"/>
+              </w:rPr>
+              <w:t>Ende</w:t>
+            </w:r>
+          </w:p>
+        </w:tc>
+        <w:tc>
+          <w:tcPr>
+            <w:tcW w:type="dxa" w:w="3099"/>
+            <w:vAlign w:val="top"/>
+            <w:tcMar>
+              <w:top w:w="80" w:type="dxa"/>
+              <w:left w:w="80" w:type="dxa"/>
+              <w:bottom w:w="80" w:type="dxa"/>
+              <w:right w:w="80" w:type="dxa"/>
+            </w:tcMar>
+          </w:tcPr>
+          <w:p>
+            <w:r/>
+            <w:r>
+              <w:rPr>
+                <w:b w:val="0"/>
+                <w:sz w:val="17"/>
+              </w:rPr>
+              <w:t>Ergebnis prüfen</w:t>
+            </w:r>
+          </w:p>
+        </w:tc>
+        <w:tc>
+          <w:tcPr>
+            <w:tcW w:type="dxa" w:w="3099"/>
+            <w:vAlign w:val="top"/>
+            <w:tcMar>
+              <w:top w:w="80" w:type="dxa"/>
+              <w:left w:w="80" w:type="dxa"/>
+              <w:bottom w:w="80" w:type="dxa"/>
+              <w:right w:w="80" w:type="dxa"/>
+            </w:tcMar>
+          </w:tcPr>
+          <w:p>
+            <w:r/>
+            <w:r>
+              <w:rPr>
+                <w:b w:val="0"/>
+                <w:sz w:val="17"/>
+              </w:rPr>
+              <w:t>PDF, Mailpit/E-Mail und Prozessvideo dienen als Nachweis</w:t>
+            </w:r>
+          </w:p>
+        </w:tc>
+      </w:tr>
+    </w:tbl>
+    <w:p>
       <w:pPr>
         <w:pStyle w:val="berschrift2"/>
       </w:pPr>
@@ -4815,8 +4945,11 @@
           </w:tcPr>
           <w:p>
             <w:pPr>
-              <w:pStyle w:val="Listenabsatz"/>
-            </w:pPr>
+              <w:jc w:val="left"/>
+            </w:pPr>
+            <w:r>
+              <w:t>1</w:t>
+            </w:r>
           </w:p>
         </w:tc>
         <w:tc>
@@ -4895,8 +5028,11 @@
           </w:tcPr>
           <w:p>
             <w:pPr>
-              <w:pStyle w:val="Listenabsatz"/>
-            </w:pPr>
+              <w:jc w:val="left"/>
+            </w:pPr>
+            <w:r>
+              <w:t>2</w:t>
+            </w:r>
           </w:p>
         </w:tc>
         <w:tc>
@@ -4974,10 +5110,10 @@
           </w:tcPr>
           <w:p>
             <w:pPr>
-              <w:ind w:left="360" w:hanging="360"/>
-            </w:pPr>
-            <w:r>
-              <w:t>2</w:t>
+              <w:jc w:val="left"/>
+            </w:pPr>
+            <w:r>
+              <w:t>3</w:t>
             </w:r>
           </w:p>
         </w:tc>
@@ -5094,10 +5230,10 @@
           </w:tcPr>
           <w:p>
             <w:pPr>
-              <w:ind w:left="360" w:hanging="360"/>
-            </w:pPr>
-            <w:r>
-              <w:t>3</w:t>
+              <w:jc w:val="left"/>
+            </w:pPr>
+            <w:r>
+              <w:t>4</w:t>
             </w:r>
           </w:p>
         </w:tc>
@@ -5282,10 +5418,10 @@
           </w:tcPr>
           <w:p>
             <w:pPr>
-              <w:ind w:left="360" w:hanging="360"/>
-            </w:pPr>
-            <w:r>
-              <w:t>4</w:t>
+              <w:jc w:val="left"/>
+            </w:pPr>
+            <w:r>
+              <w:t>5</w:t>
             </w:r>
           </w:p>
         </w:tc>
@@ -5360,10 +5496,10 @@
           </w:tcPr>
           <w:p>
             <w:pPr>
-              <w:ind w:left="360" w:hanging="360"/>
-            </w:pPr>
-            <w:r>
-              <w:t>5</w:t>
+              <w:jc w:val="left"/>
+            </w:pPr>
+            <w:r>
+              <w:t>6</w:t>
             </w:r>
           </w:p>
         </w:tc>
@@ -5474,10 +5610,10 @@
           </w:tcPr>
           <w:p>
             <w:pPr>
-              <w:ind w:left="360" w:hanging="360"/>
-            </w:pPr>
-            <w:r>
-              <w:t>6</w:t>
+              <w:jc w:val="left"/>
+            </w:pPr>
+            <w:r>
+              <w:t>7</w:t>
             </w:r>
           </w:p>
         </w:tc>
@@ -5555,10 +5691,10 @@
           </w:tcPr>
           <w:p>
             <w:pPr>
-              <w:ind w:left="360" w:hanging="360"/>
-            </w:pPr>
-            <w:r>
-              <w:t>7</w:t>
+              <w:jc w:val="left"/>
+            </w:pPr>
+            <w:r>
+              <w:t>8</w:t>
             </w:r>
           </w:p>
         </w:tc>
@@ -5669,10 +5805,10 @@
           </w:tcPr>
           <w:p>
             <w:pPr>
-              <w:ind w:left="360" w:hanging="360"/>
-            </w:pPr>
-            <w:r>
-              <w:t>8</w:t>
+              <w:jc w:val="left"/>
+            </w:pPr>
+            <w:r>
+              <w:t>9</w:t>
             </w:r>
           </w:p>
         </w:tc>
@@ -5809,10 +5945,10 @@
           </w:tcPr>
           <w:p>
             <w:pPr>
-              <w:ind w:left="360" w:hanging="360"/>
-            </w:pPr>
-            <w:r>
-              <w:t>9</w:t>
+              <w:jc w:val="left"/>
+            </w:pPr>
+            <w:r>
+              <w:t>10</w:t>
             </w:r>
           </w:p>
         </w:tc>
@@ -5882,13 +6018,10 @@
           </w:tcPr>
           <w:p>
             <w:pPr>
-              <w:ind w:left="360" w:hanging="360"/>
-            </w:pPr>
-            <w:r>
-              <w:t>1</w:t>
-            </w:r>
-            <w:r>
-              <w:t>0</w:t>
+              <w:jc w:val="left"/>
+            </w:pPr>
+            <w:r>
+              <w:t>11</w:t>
             </w:r>
           </w:p>
         </w:tc>
@@ -5965,13 +6098,10 @@
           </w:tcPr>
           <w:p>
             <w:pPr>
-              <w:ind w:left="360" w:hanging="360"/>
-            </w:pPr>
-            <w:r>
-              <w:t>1</w:t>
-            </w:r>
-            <w:r>
-              <w:t>1</w:t>
+              <w:jc w:val="left"/>
+            </w:pPr>
+            <w:r>
+              <w:t>12</w:t>
             </w:r>
           </w:p>
         </w:tc>
@@ -6064,13 +6194,10 @@
           </w:tcPr>
           <w:p>
             <w:pPr>
-              <w:ind w:left="360" w:hanging="360"/>
-            </w:pPr>
-            <w:r>
-              <w:t>1</w:t>
-            </w:r>
-            <w:r>
-              <w:t>2</w:t>
+              <w:jc w:val="left"/>
+            </w:pPr>
+            <w:r>
+              <w:t>13</w:t>
             </w:r>
           </w:p>
         </w:tc>
@@ -6185,13 +6312,10 @@
           </w:tcPr>
           <w:p>
             <w:pPr>
-              <w:ind w:left="360" w:hanging="360"/>
-            </w:pPr>
-            <w:r>
-              <w:t>1</w:t>
-            </w:r>
-            <w:r>
-              <w:t>3</w:t>
+              <w:jc w:val="left"/>
+            </w:pPr>
+            <w:r>
+              <w:t>14</w:t>
             </w:r>
           </w:p>
         </w:tc>
@@ -6253,13 +6377,10 @@
           </w:tcPr>
           <w:p>
             <w:pPr>
-              <w:ind w:left="360" w:hanging="360"/>
-            </w:pPr>
-            <w:r>
-              <w:t>1</w:t>
-            </w:r>
-            <w:r>
-              <w:t>4</w:t>
+              <w:jc w:val="left"/>
+            </w:pPr>
+            <w:r>
+              <w:t>15</w:t>
             </w:r>
           </w:p>
         </w:tc>
@@ -6378,7 +6499,7 @@
           </w:tcPr>
           <w:p>
             <w:pPr>
-              <w:ind w:left="360" w:hanging="360"/>
+              <w:jc w:val="left"/>
             </w:pPr>
             <w:r>
               <w:t>16</w:t>
@@ -8319,6 +8440,106 @@
           <w:docGrid w:linePitch="360"/>
         </w:sectPr>
       </w:pPr>
+    </w:p>
+    <w:p>
+      <w:pPr>
+        <w:pStyle w:val="berschrift1"/>
+      </w:pPr>
+      <w:r>
+        <w:t>Herausforderungen, Chancen und AI-Ausblick</w:t>
+      </w:r>
+    </w:p>
+    <w:p>
+      <w:pPr>
+        <w:pStyle w:val="berschrift2"/>
+      </w:pPr>
+      <w:r>
+        <w:t>Herausforderungen</w:t>
+      </w:r>
+    </w:p>
+    <w:p>
+      <w:pPr/>
+      <w:r>
+        <w:t>Die grösste technische Herausforderung ist die Stabilität der Schnittstellen. Moodle-Session, lokaler Docker-Container und Gemini API müssen erreichbar sein; sonst muss der Roboter sauber abbrechen oder den Fall sichtbar markieren.</w:t>
+      </w:r>
+    </w:p>
+    <w:p>
+      <w:pPr/>
+      <w:r>
+        <w:t>Eine zweite Herausforderung ist die Qualität der LLM-Antwort. Der Lernplan darf nicht einfach als Wahrheit übernommen werden. Deshalb braucht der Prozess Pflichtfelder, Quellenbezug, Mindestlänge und eine Retry-Logik.</w:t>
+      </w:r>
+    </w:p>
+    <w:p>
+      <w:pPr/>
+      <w:r>
+        <w:t>Für die Nachweisführung mussten zudem Secrets konsequent verborgen werden. API Keys, Passwörter und Tokens dürfen weder im Video noch in Screenshots oder Git-Dateien sichtbar sein.</w:t>
+      </w:r>
+    </w:p>
+    <w:p>
+      <w:pPr>
+        <w:pStyle w:val="berschrift2"/>
+      </w:pPr>
+      <w:r>
+        <w:t>Chancen</w:t>
+      </w:r>
+    </w:p>
+    <w:p>
+      <w:pPr/>
+      <w:r>
+        <w:t>Die Automatisierung reduziert wiederholtes Copy/Paste aus Moodle, senkt das Risiko von Übertragungsfehlern und macht die Quellenlage nachvollziehbarer, weil Quellen-JSON und PDF-Ergebnis gemeinsam abgelegt werden.</w:t>
+      </w:r>
+    </w:p>
+    <w:p>
+      <w:pPr/>
+      <w:r>
+        <w:t>Der Prozess kann auf mehrere Kurse, mehrere Studierende oder weitere Studiengänge übertragen werden. Dadurch steigt der Nutzen deutlich gegenüber einem einmaligen Einzelprozess.</w:t>
+      </w:r>
+    </w:p>
+    <w:p>
+      <w:pPr/>
+      <w:r>
+        <w:t>Die Lösung schafft ausserdem eine wiederverwendbare Architektur: UiPath orchestriert, die Moodle API liefert Daten, Gemini strukturiert Inhalte und der Renderer erzeugt nachvollziehbare Dokumente.</w:t>
+      </w:r>
+    </w:p>
+    <w:p>
+      <w:pPr>
+        <w:pStyle w:val="berschrift2"/>
+      </w:pPr>
+      <w:r>
+        <w:t>Verbesserung durch Analytics, Machine Learning und AI</w:t>
+      </w:r>
+    </w:p>
+    <w:p>
+      <w:pPr/>
+      <w:r>
+        <w:t>Analytics könnte künftig messen, welche Moodle-Ressourcen besonders häufig in Lernplänen verwendet werden und bei welchen Kursen der Bot oft Warnungen erzeugt. Daraus liesse sich ableiten, wo Kursdaten verbessert oder anders strukturiert werden sollten.</w:t>
+      </w:r>
+    </w:p>
+    <w:p>
+      <w:pPr/>
+      <w:r>
+        <w:t>Machine-Learning-Ansätze könnten Ressourcen automatisch klassifizieren, zum Beispiel Modulbeschreibung, Semesterinformation, Aufgabenstellung, Folien oder Bewertungsraster. Dadurch müsste der Bot weniger über Dateinamen und einfache Regeln entscheiden.</w:t>
+      </w:r>
+    </w:p>
+    <w:p>
+      <w:pPr/>
+      <w:r>
+        <w:t>Generative AI kann den Lernplan weiter verbessern, bleibt aber ein unterstützender Schritt. Sinnvoll sind Quellenzitate, Validierungsregeln und eine menschliche Endkontrolle, damit keine erfundenen Inhalte ungeprüft in den Lernplan gelangen.</w:t>
+      </w:r>
+    </w:p>
+    <w:p>
+      <w:pPr>
+        <w:pStyle w:val="berschrift2"/>
+      </w:pPr>
+      <w:r>
+        <w:t>Ausblick</w:t>
+      </w:r>
+    </w:p>
+    <w:p>
+      <w:pPr/>
+      <w:r>
+        <w:t>Für den Studienkontext ist der nächste sinnvolle Schritt eine stabilere Mehrkurs-Verarbeitung mit Kalenderintegration und klarer Benutzerfreigabe vor dem Versand. In einem organisatorischen Kontext könnte derselbe Ansatz auch für Onboarding-Unterlagen, interne Schulungen oder wiederkehrende Reporting-Prozesse verwendet werden.</w:t>
+      </w:r>
     </w:p>
     <w:p>
       <w:pPr>
@@ -9133,6 +9354,401 @@
       <w:pPr>
         <w:pStyle w:val="berschrift1"/>
       </w:pPr>
+      <w:r>
+        <w:t>Reflexion und Arbeitsaufteilung</w:t>
+      </w:r>
+    </w:p>
+    <w:p>
+      <w:pPr>
+        <w:pStyle w:val="berschrift2"/>
+      </w:pPr>
+      <w:r>
+        <w:t>Reflexion des Lernprozesses</w:t>
+      </w:r>
+    </w:p>
+    <w:p>
+      <w:pPr/>
+      <w:r>
+        <w:t>Das Projekt zeigte, dass RPA nicht nur aus Klick-Automatisierung besteht. Für einen robusten Prozess waren API-Zugriff, lokale Konfiguration, Fehlerbehandlung, Dokument-Rendering und Nachweisführung mindestens genauso wichtig wie der UiPath-Workflow selbst.</w:t>
+      </w:r>
+    </w:p>
+    <w:p>
+      <w:pPr/>
+      <w:r>
+        <w:t>Besonders lehrreich war die Abgrenzung zwischen vollautomatischer Verarbeitung und sinnvoller menschlicher Kontrolle. LLMs liefern schnell strukturierte Ergebnisse, benötigen aber Quellenbezug und Validierung, damit der Output verlässlich bleibt.</w:t>
+      </w:r>
+    </w:p>
+    <w:p>
+      <w:pPr/>
+      <w:r>
+        <w:t>Die Videoaufzeichnung und die PDF-Prüfung machten sichtbar, dass ein Ergebnis nicht nur technisch erzeugt werden muss, sondern für die Bewertung nachvollziehbar, lesbar und ohne sichtbare Secrets dokumentiert sein muss.</w:t>
+      </w:r>
+    </w:p>
+    <w:p>
+      <w:pPr>
+        <w:pStyle w:val="berschrift2"/>
+      </w:pPr>
+      <w:r>
+        <w:t>Arbeitsaufteilung in der Gruppe</w:t>
+      </w:r>
+    </w:p>
+    <w:tbl>
+      <w:tblPr>
+        <w:tblStyle w:val="Tabellenraster"/>
+        <w:tblW w:type="auto" w:w="0"/>
+        <w:jc w:val="center"/>
+        <w:tblLook w:firstColumn="1" w:firstRow="1" w:lastColumn="0" w:lastRow="0" w:noHBand="0" w:noVBand="1" w:val="04A0"/>
+      </w:tblPr>
+      <w:tblGrid>
+        <w:gridCol w:w="3099"/>
+        <w:gridCol w:w="3099"/>
+        <w:gridCol w:w="3099"/>
+      </w:tblGrid>
+      <w:tr>
+        <w:tc>
+          <w:tcPr>
+            <w:tcW w:type="dxa" w:w="3099"/>
+            <w:vAlign w:val="top"/>
+            <w:tcMar>
+              <w:top w:w="80" w:type="dxa"/>
+              <w:left w:w="80" w:type="dxa"/>
+              <w:bottom w:w="80" w:type="dxa"/>
+              <w:right w:w="80" w:type="dxa"/>
+            </w:tcMar>
+          </w:tcPr>
+          <w:p>
+            <w:r/>
+            <w:r>
+              <w:rPr>
+                <w:b/>
+                <w:sz w:val="17"/>
+              </w:rPr>
+              <w:t>Person</w:t>
+            </w:r>
+          </w:p>
+        </w:tc>
+        <w:tc>
+          <w:tcPr>
+            <w:tcW w:type="dxa" w:w="3099"/>
+            <w:vAlign w:val="top"/>
+            <w:tcMar>
+              <w:top w:w="80" w:type="dxa"/>
+              <w:left w:w="80" w:type="dxa"/>
+              <w:bottom w:w="80" w:type="dxa"/>
+              <w:right w:w="80" w:type="dxa"/>
+            </w:tcMar>
+          </w:tcPr>
+          <w:p>
+            <w:r/>
+            <w:r>
+              <w:rPr>
+                <w:b/>
+                <w:sz w:val="17"/>
+              </w:rPr>
+              <w:t>Rolle</w:t>
+            </w:r>
+          </w:p>
+        </w:tc>
+        <w:tc>
+          <w:tcPr>
+            <w:tcW w:type="dxa" w:w="3099"/>
+            <w:vAlign w:val="top"/>
+            <w:tcMar>
+              <w:top w:w="80" w:type="dxa"/>
+              <w:left w:w="80" w:type="dxa"/>
+              <w:bottom w:w="80" w:type="dxa"/>
+              <w:right w:w="80" w:type="dxa"/>
+            </w:tcMar>
+          </w:tcPr>
+          <w:p>
+            <w:r/>
+            <w:r>
+              <w:rPr>
+                <w:b/>
+                <w:sz w:val="17"/>
+              </w:rPr>
+              <w:t>Beitrag</w:t>
+            </w:r>
+          </w:p>
+        </w:tc>
+      </w:tr>
+      <w:tr>
+        <w:tc>
+          <w:tcPr>
+            <w:tcW w:type="dxa" w:w="3099"/>
+            <w:vAlign w:val="top"/>
+            <w:tcMar>
+              <w:top w:w="80" w:type="dxa"/>
+              <w:left w:w="80" w:type="dxa"/>
+              <w:bottom w:w="80" w:type="dxa"/>
+              <w:right w:w="80" w:type="dxa"/>
+            </w:tcMar>
+          </w:tcPr>
+          <w:p>
+            <w:r/>
+            <w:r>
+              <w:rPr>
+                <w:b/>
+                <w:sz w:val="17"/>
+              </w:rPr>
+              <w:t>Florin Gartmann</w:t>
+            </w:r>
+          </w:p>
+        </w:tc>
+        <w:tc>
+          <w:tcPr>
+            <w:tcW w:type="dxa" w:w="3099"/>
+            <w:vAlign w:val="top"/>
+            <w:tcMar>
+              <w:top w:w="80" w:type="dxa"/>
+              <w:left w:w="80" w:type="dxa"/>
+              <w:bottom w:w="80" w:type="dxa"/>
+              <w:right w:w="80" w:type="dxa"/>
+            </w:tcMar>
+          </w:tcPr>
+          <w:p>
+            <w:r/>
+            <w:r>
+              <w:rPr>
+                <w:b w:val="0"/>
+                <w:sz w:val="17"/>
+              </w:rPr>
+              <w:t>Projektleitung / RPA Business Analyst</w:t>
+            </w:r>
+          </w:p>
+        </w:tc>
+        <w:tc>
+          <w:tcPr>
+            <w:tcW w:type="dxa" w:w="3099"/>
+            <w:vAlign w:val="top"/>
+            <w:tcMar>
+              <w:top w:w="80" w:type="dxa"/>
+              <w:left w:w="80" w:type="dxa"/>
+              <w:bottom w:w="80" w:type="dxa"/>
+              <w:right w:w="80" w:type="dxa"/>
+            </w:tcMar>
+          </w:tcPr>
+          <w:p>
+            <w:r/>
+            <w:r>
+              <w:rPr>
+                <w:b w:val="0"/>
+                <w:sz w:val="17"/>
+              </w:rPr>
+              <w:t>Koordination, fachliche Einordnung, Prozessqualifizierung und Abstimmung der Abgabeunterlagen</w:t>
+            </w:r>
+          </w:p>
+        </w:tc>
+      </w:tr>
+      <w:tr>
+        <w:tc>
+          <w:tcPr>
+            <w:tcW w:type="dxa" w:w="3099"/>
+            <w:vAlign w:val="top"/>
+            <w:tcMar>
+              <w:top w:w="80" w:type="dxa"/>
+              <w:left w:w="80" w:type="dxa"/>
+              <w:bottom w:w="80" w:type="dxa"/>
+              <w:right w:w="80" w:type="dxa"/>
+            </w:tcMar>
+          </w:tcPr>
+          <w:p>
+            <w:r/>
+            <w:r>
+              <w:rPr>
+                <w:b/>
+                <w:sz w:val="17"/>
+              </w:rPr>
+              <w:t>Oliver Schütz</w:t>
+            </w:r>
+          </w:p>
+        </w:tc>
+        <w:tc>
+          <w:tcPr>
+            <w:tcW w:type="dxa" w:w="3099"/>
+            <w:vAlign w:val="top"/>
+            <w:tcMar>
+              <w:top w:w="80" w:type="dxa"/>
+              <w:left w:w="80" w:type="dxa"/>
+              <w:bottom w:w="80" w:type="dxa"/>
+              <w:right w:w="80" w:type="dxa"/>
+            </w:tcMar>
+          </w:tcPr>
+          <w:p>
+            <w:r/>
+            <w:r>
+              <w:rPr>
+                <w:b w:val="0"/>
+                <w:sz w:val="17"/>
+              </w:rPr>
+              <w:t>Prozessverantwortlicher</w:t>
+            </w:r>
+          </w:p>
+        </w:tc>
+        <w:tc>
+          <w:tcPr>
+            <w:tcW w:type="dxa" w:w="3099"/>
+            <w:vAlign w:val="top"/>
+            <w:tcMar>
+              <w:top w:w="80" w:type="dxa"/>
+              <w:left w:w="80" w:type="dxa"/>
+              <w:bottom w:w="80" w:type="dxa"/>
+              <w:right w:w="80" w:type="dxa"/>
+            </w:tcMar>
+          </w:tcPr>
+          <w:p>
+            <w:r/>
+            <w:r>
+              <w:rPr>
+                <w:b w:val="0"/>
+                <w:sz w:val="17"/>
+              </w:rPr>
+              <w:t>Moodle-Prozess, Datenquellen, Dokumentation, Screenshots, Prozessvideo und Qualitätsprüfung der Nachweise</w:t>
+            </w:r>
+          </w:p>
+        </w:tc>
+      </w:tr>
+      <w:tr>
+        <w:tc>
+          <w:tcPr>
+            <w:tcW w:type="dxa" w:w="3099"/>
+            <w:vAlign w:val="top"/>
+            <w:tcMar>
+              <w:top w:w="80" w:type="dxa"/>
+              <w:left w:w="80" w:type="dxa"/>
+              <w:bottom w:w="80" w:type="dxa"/>
+              <w:right w:w="80" w:type="dxa"/>
+            </w:tcMar>
+          </w:tcPr>
+          <w:p>
+            <w:r/>
+            <w:r>
+              <w:rPr>
+                <w:b/>
+                <w:sz w:val="17"/>
+              </w:rPr>
+              <w:t>Alessio De Icco</w:t>
+            </w:r>
+          </w:p>
+        </w:tc>
+        <w:tc>
+          <w:tcPr>
+            <w:tcW w:type="dxa" w:w="3099"/>
+            <w:vAlign w:val="top"/>
+            <w:tcMar>
+              <w:top w:w="80" w:type="dxa"/>
+              <w:left w:w="80" w:type="dxa"/>
+              <w:bottom w:w="80" w:type="dxa"/>
+              <w:right w:w="80" w:type="dxa"/>
+            </w:tcMar>
+          </w:tcPr>
+          <w:p>
+            <w:r/>
+            <w:r>
+              <w:rPr>
+                <w:b w:val="0"/>
+                <w:sz w:val="17"/>
+              </w:rPr>
+              <w:t>Teamleiter / Sachbearbeiter</w:t>
+            </w:r>
+          </w:p>
+        </w:tc>
+        <w:tc>
+          <w:tcPr>
+            <w:tcW w:type="dxa" w:w="3099"/>
+            <w:vAlign w:val="top"/>
+            <w:tcMar>
+              <w:top w:w="80" w:type="dxa"/>
+              <w:left w:w="80" w:type="dxa"/>
+              <w:bottom w:w="80" w:type="dxa"/>
+              <w:right w:w="80" w:type="dxa"/>
+            </w:tcMar>
+          </w:tcPr>
+          <w:p>
+            <w:r/>
+            <w:r>
+              <w:rPr>
+                <w:b w:val="0"/>
+                <w:sz w:val="17"/>
+              </w:rPr>
+              <w:t>Anforderungen aus Benutzersicht, Prozessvalidierung und Prüfung der Verständlichkeit des Zieloutputs</w:t>
+            </w:r>
+          </w:p>
+        </w:tc>
+      </w:tr>
+      <w:tr>
+        <w:tc>
+          <w:tcPr>
+            <w:tcW w:type="dxa" w:w="3099"/>
+            <w:vAlign w:val="top"/>
+            <w:tcMar>
+              <w:top w:w="80" w:type="dxa"/>
+              <w:left w:w="80" w:type="dxa"/>
+              <w:bottom w:w="80" w:type="dxa"/>
+              <w:right w:w="80" w:type="dxa"/>
+            </w:tcMar>
+          </w:tcPr>
+          <w:p>
+            <w:r/>
+            <w:r>
+              <w:rPr>
+                <w:b/>
+                <w:sz w:val="17"/>
+              </w:rPr>
+              <w:t>Michal Karczmarzyk</w:t>
+            </w:r>
+          </w:p>
+        </w:tc>
+        <w:tc>
+          <w:tcPr>
+            <w:tcW w:type="dxa" w:w="3099"/>
+            <w:vAlign w:val="top"/>
+            <w:tcMar>
+              <w:top w:w="80" w:type="dxa"/>
+              <w:left w:w="80" w:type="dxa"/>
+              <w:bottom w:w="80" w:type="dxa"/>
+              <w:right w:w="80" w:type="dxa"/>
+            </w:tcMar>
+          </w:tcPr>
+          <w:p>
+            <w:r/>
+            <w:r>
+              <w:rPr>
+                <w:b w:val="0"/>
+                <w:sz w:val="17"/>
+              </w:rPr>
+              <w:t>RPA Entwickler</w:t>
+            </w:r>
+          </w:p>
+        </w:tc>
+        <w:tc>
+          <w:tcPr>
+            <w:tcW w:type="dxa" w:w="3099"/>
+            <w:vAlign w:val="top"/>
+            <w:tcMar>
+              <w:top w:w="80" w:type="dxa"/>
+              <w:left w:w="80" w:type="dxa"/>
+              <w:bottom w:w="80" w:type="dxa"/>
+              <w:right w:w="80" w:type="dxa"/>
+            </w:tcMar>
+          </w:tcPr>
+          <w:p>
+            <w:r/>
+            <w:r>
+              <w:rPr>
+                <w:b w:val="0"/>
+                <w:sz w:val="17"/>
+              </w:rPr>
+              <w:t>UiPath-/Skript-Umsetzung, technische Prozessschritte, API-Anbindung und Fehlerbehandlung</w:t>
+            </w:r>
+          </w:p>
+        </w:tc>
+      </w:tr>
+    </w:tbl>
+    <w:p>
+      <w:pPr>
+        <w:pStyle w:val="berschrift1"/>
+      </w:pPr>
       <w:bookmarkStart w:name="_Toc161134777" w:id="25"/>
       <w:bookmarkStart w:name="_Toc189321246" w:id="26"/>
       <w:r>
@@ -9155,19 +9771,7 @@
     </w:p>
     <w:p>
       <w:r>
-        <w:t>Die Logindaten</w:t>
-      </w:r>
-      <w:r>
-        <w:t>,</w:t>
-      </w:r>
-      <w:r>
-        <w:t xml:space="preserve"> welche für die Applikationen und Systeme verwendet werden, werden </w:t>
-      </w:r>
-      <w:r>
-        <w:t>… gespeichert</w:t>
-      </w:r>
-      <w:r>
-        <w:t>.</w:t>
+        <w:t>Die Logindaten und API Keys werden lokal in der .env-Datei beziehungsweise in UiPath-Konfigurationen gespeichert. Die Datei .env ist von Git ausgeschlossen. Im Repo liegt nur .env.example mit Variablennamen. Für Moodle werden MOODLE_USERNAME und MOODLE_PASSWORD verwendet; für Gemini wird GEMINI_API_KEY lokal gesetzt. In Videos, Screenshots und Logs dürfen diese Werte nicht sichtbar sein.</w:t>
       </w:r>
     </w:p>
     <w:p/>

</xml_diff>